<commit_message>
Return the three evidence figures to the main text
Figures showing the cross-chorus comparison, the Cosmic Rays / Bluebird
contours, and the "My Little Suede Shoes" outlier move back from the appendix
into the body. Each is the evidence for a claim the body makes: that heads are
simpler than solo choruses, that temporal architecture is tune-specific, and
that the trap-door structure exists at all. Asserting those in the text while
keeping the plots in an appendix put the claim and its support in different
places.

The appendix keeps the three figures that are genuinely supplementary: the
analysis-pipeline schematic, the per-tune head-versus-chorus scatter (which
overlaps the new Figure 4), and the autocorrelation profiles.

Body now carries ten figures and the appendix three, renumbered throughout.

Co-Authored-By: Claude Opus 5 (1M context) <noreply@anthropic.com>
</commit_message>
<xml_diff>
--- a/EMR/Bird_Over_Time_EMR.docx
+++ b/EMR/Bird_Over_Time_EMR.docx
@@ -1476,7 +1476,7 @@
           <w:rFonts w:ascii="Times New Roman" w:hAnsi="Times New Roman"/>
           <w:sz w:val="20"/>
         </w:rPr>
-        <w:t>The resulting phrases are short. A phrase spans a median of 1 harmonic segment (M = 2.01, range 1–12), and 54.3% of phrases consist of a single segment while 74.6% consist of two or fewer. This follows from the interaction of two facts already stated: bebop phrasing is densely articulated with short rests, while segments are as long as the harmonic rhythm. A phrase that falls within one chord symbol therefore contributes a single observation, and for just over half the corpus the phrase-level series is effectively a subsampled segment-level series. Phrase-level results below should be read with this in mind: they describe organization at the scale of rest-delimited gestures, which in this repertoire is often the scale of one chord, and the phrase-level analyses are for that reason reported alongside rolling-window and chorus-level analyses rather than on their own. Figure 8 sets out the five analyses that proceed from the detected phrases and the scale each addresses.</w:t>
+        <w:t>The resulting phrases are short. A phrase spans a median of 1 harmonic segment (M = 2.01, range 1–12), and 54.3% of phrases consist of a single segment while 74.6% consist of two or fewer. This follows from the interaction of two facts already stated: bebop phrasing is densely articulated with short rests, while segments are as long as the harmonic rhythm. A phrase that falls within one chord symbol therefore contributes a single observation, and for just over half the corpus the phrase-level series is effectively a subsampled segment-level series. Phrase-level results below should be read with this in mind: they describe organization at the scale of rest-delimited gestures, which in this repertoire is often the scale of one chord, and the phrase-level analyses are for that reason reported alongside rolling-window and chorus-level analyses rather than on their own. Figure 11 sets out the five analyses that proceed from the detected phrases and the scale each addresses.</w:t>
       </w:r>
     </w:p>
     <w:p>
@@ -5694,28 +5694,8 @@
           <w:rFonts w:ascii="Times New Roman" w:hAnsi="Times New Roman"/>
           <w:sz w:val="20"/>
         </w:rPr>
-        <w:t xml:space="preserve"> likely reflects melodic construction prioritizing memorable contour and singability over maximal harmonic density. Heads establish the core vocabulary while maintaining thematic clarity; improvised choruses then explore denser harmonic regions enabled by the absence of melodic memorability constraints. Figure 9 compares mean complexity across chorus positions directly.</w:t>
-      </w:r>
-    </w:p>
-    <w:p>
-      <w:pPr>
-        <w:spacing w:before="0" w:after="0"/>
-        <w:ind w:firstLine="720"/>
-        <w:jc w:val="both"/>
-      </w:pPr>
-      <w:r>
-        <w:rPr>
-          <w:rFonts w:ascii="Times New Roman" w:hAnsi="Times New Roman"/>
-          <w:sz w:val="20"/>
-        </w:rPr>
-        <w:t>Parker's core harmonic vocabulary is largely established in Chorus 1, the composed head. Chorus 1 already contains 81.1% of all distinct interval vectors that appear anywhere in the corpus, Chorus 2 adds a further 16.5%, and Choruses 3 and later contribute 2.4% between them (Figure 4). This is a corpus-level statistic rather than a single performance: chorus numbers are assigned per tune by dividing measure position by form length (12 bars for blues, 32 otherwise), the distinct vectors occurring in each chorus position are pooled across all 46 MIDI-aligned tunes, and coverage is then accumulated across chorus positions. Temporal evolution thus reflects primarily the exploration of new pathways connecting existing harmonic nodes rather than progressive vocabulary expansion.</w:t>
-      </w:r>
-    </w:p>
-    <w:p>
-      <w:pPr>
-        <w:spacing w:before="0" w:after="0"/>
-        <w:jc w:val="both"/>
-      </w:pPr>
+        <w:t xml:space="preserve"> likely reflects melodic construction prioritizing memorable contour and singability over maximal harmonic density. Heads establish the core vocabulary while maintaining thematic clarity; improvised choruses then explore denser harmonic regions enabled by the absence of melodic memorability constraints. Figure 4 compares mean complexity across chorus positions directly.</w:t>
+      </w:r>
     </w:p>
     <w:p>
       <w:pPr>
@@ -5733,7 +5713,7 @@
               <a:graphicData uri="http://schemas.openxmlformats.org/drawingml/2006/picture">
                 <pic:pic>
                   <pic:nvPicPr>
-                    <pic:cNvPr id="0" name="fig_6.png"/>
+                    <pic:cNvPr id="0" name="fig_7.png"/>
                     <pic:cNvPicPr/>
                   </pic:nvPicPr>
                   <pic:blipFill>
@@ -5774,6 +5754,92 @@
           <w:rFonts w:ascii="Times New Roman" w:hAnsi="Times New Roman"/>
           <w:sz w:val="20"/>
         </w:rPr>
+        <w:t>Cross-chorus complexity comparison showing head is simpler than improvised choruses.</w:t>
+      </w:r>
+    </w:p>
+    <w:p>
+      <w:pPr>
+        <w:spacing w:before="0" w:after="0"/>
+        <w:jc w:val="both"/>
+      </w:pPr>
+    </w:p>
+    <w:p>
+      <w:pPr>
+        <w:spacing w:before="0" w:after="0"/>
+        <w:ind w:firstLine="720"/>
+        <w:jc w:val="both"/>
+      </w:pPr>
+      <w:r>
+        <w:rPr>
+          <w:rFonts w:ascii="Times New Roman" w:hAnsi="Times New Roman"/>
+          <w:sz w:val="20"/>
+        </w:rPr>
+        <w:t>Parker's core harmonic vocabulary is largely established in Chorus 1, the composed head. Chorus 1 already contains 81.1% of all distinct interval vectors that appear anywhere in the corpus, Chorus 2 adds a further 16.5%, and Choruses 3 and later contribute 2.4% between them (Figure 5). This is a corpus-level statistic rather than a single performance: chorus numbers are assigned per tune by dividing measure position by form length (12 bars for blues, 32 otherwise), the distinct vectors occurring in each chorus position are pooled across all 46 MIDI-aligned tunes, and coverage is then accumulated across chorus positions. Temporal evolution thus reflects primarily the exploration of new pathways connecting existing harmonic nodes rather than progressive vocabulary expansion.</w:t>
+      </w:r>
+    </w:p>
+    <w:p>
+      <w:pPr>
+        <w:spacing w:before="0" w:after="0"/>
+        <w:jc w:val="both"/>
+      </w:pPr>
+    </w:p>
+    <w:p>
+      <w:pPr>
+        <w:jc w:val="center"/>
+      </w:pPr>
+      <w:r>
+        <w:drawing>
+          <wp:inline xmlns:a="http://schemas.openxmlformats.org/drawingml/2006/main" xmlns:pic="http://schemas.openxmlformats.org/drawingml/2006/picture">
+            <wp:extent cx="5029200" cy="2514600"/>
+            <wp:docPr id="5" name="Picture 5"/>
+            <wp:cNvGraphicFramePr>
+              <a:graphicFrameLocks noChangeAspect="1"/>
+            </wp:cNvGraphicFramePr>
+            <a:graphic>
+              <a:graphicData uri="http://schemas.openxmlformats.org/drawingml/2006/picture">
+                <pic:pic>
+                  <pic:nvPicPr>
+                    <pic:cNvPr id="0" name="fig_6.png"/>
+                    <pic:cNvPicPr/>
+                  </pic:nvPicPr>
+                  <pic:blipFill>
+                    <a:blip r:embed="rId21"/>
+                    <a:stretch>
+                      <a:fillRect/>
+                    </a:stretch>
+                  </pic:blipFill>
+                  <pic:spPr>
+                    <a:xfrm>
+                      <a:off x="0" y="0"/>
+                      <a:ext cx="5029200" cy="2514600"/>
+                    </a:xfrm>
+                    <a:prstGeom prst="rect"/>
+                  </pic:spPr>
+                </pic:pic>
+              </a:graphicData>
+            </a:graphic>
+          </wp:inline>
+        </w:drawing>
+      </w:r>
+    </w:p>
+    <w:p>
+      <w:pPr>
+        <w:spacing w:before="120" w:after="120"/>
+        <w:jc w:val="both"/>
+      </w:pPr>
+      <w:r>
+        <w:rPr>
+          <w:rFonts w:ascii="Times New Roman" w:hAnsi="Times New Roman"/>
+          <w:b/>
+          <w:sz w:val="20"/>
+        </w:rPr>
+        <w:t xml:space="preserve">Fig. 5. </w:t>
+      </w:r>
+      <w:r>
+        <w:rPr>
+          <w:rFonts w:ascii="Times New Roman" w:hAnsi="Times New Roman"/>
+          <w:sz w:val="20"/>
+        </w:rPr>
         <w:t>Cumulative vocabulary coverage across chorus positions, pooled across the 46 MIDI-aligned tunes. Chorus 1 (the head) accounts for 81.1% of all distinct interval vectors in the corpus, Chorus 2 (the first improvised chorus) adds 16.5%, and Choruses 3–5 add 2.4% in total. The curves are flat over long stretches because each step adds only interval vectors not already seen: once the common vocabulary has appeared, most later segments repeat it and contribute nothing new.</w:t>
       </w:r>
     </w:p>
@@ -5900,8 +5966,80 @@
           <w:rFonts w:ascii="Times New Roman" w:hAnsi="Times New Roman"/>
           <w:sz w:val="20"/>
         </w:rPr>
-        <w:t>This finding suggests Parker conceives each tune's improvisational arc holistically rather than applying a single approach across all contexts. Figure 10 plots the two contours against one another, with the composed head shown alongside the improvised choruses in each case.</w:t>
-      </w:r>
+        <w:t>This finding suggests Parker conceives each tune's improvisational arc holistically rather than applying a single approach across all contexts. Figure 6 plots the two contours against one another, with the composed head shown alongside the improvised choruses in each case.</w:t>
+      </w:r>
+    </w:p>
+    <w:p>
+      <w:pPr>
+        <w:spacing w:before="0" w:after="0"/>
+        <w:jc w:val="both"/>
+      </w:pPr>
+    </w:p>
+    <w:p>
+      <w:pPr>
+        <w:jc w:val="center"/>
+      </w:pPr>
+      <w:r>
+        <w:drawing>
+          <wp:inline xmlns:a="http://schemas.openxmlformats.org/drawingml/2006/main" xmlns:pic="http://schemas.openxmlformats.org/drawingml/2006/picture">
+            <wp:extent cx="5029200" cy="3771900"/>
+            <wp:docPr id="6" name="Picture 6"/>
+            <wp:cNvGraphicFramePr>
+              <a:graphicFrameLocks noChangeAspect="1"/>
+            </wp:cNvGraphicFramePr>
+            <a:graphic>
+              <a:graphicData uri="http://schemas.openxmlformats.org/drawingml/2006/picture">
+                <pic:pic>
+                  <pic:nvPicPr>
+                    <pic:cNvPr id="0" name="fig_8.png"/>
+                    <pic:cNvPicPr/>
+                  </pic:nvPicPr>
+                  <pic:blipFill>
+                    <a:blip r:embed="rId22"/>
+                    <a:stretch>
+                      <a:fillRect/>
+                    </a:stretch>
+                  </pic:blipFill>
+                  <pic:spPr>
+                    <a:xfrm>
+                      <a:off x="0" y="0"/>
+                      <a:ext cx="5029200" cy="3771900"/>
+                    </a:xfrm>
+                    <a:prstGeom prst="rect"/>
+                  </pic:spPr>
+                </pic:pic>
+              </a:graphicData>
+            </a:graphic>
+          </wp:inline>
+        </w:drawing>
+      </w:r>
+    </w:p>
+    <w:p>
+      <w:pPr>
+        <w:spacing w:before="120" w:after="120"/>
+        <w:jc w:val="both"/>
+      </w:pPr>
+      <w:r>
+        <w:rPr>
+          <w:rFonts w:ascii="Times New Roman" w:hAnsi="Times New Roman"/>
+          <w:b/>
+          <w:sz w:val="20"/>
+        </w:rPr>
+        <w:t xml:space="preserve">Fig. 6. </w:t>
+      </w:r>
+      <w:r>
+        <w:rPr>
+          <w:rFonts w:ascii="Times New Roman" w:hAnsi="Times New Roman"/>
+          <w:sz w:val="20"/>
+        </w:rPr>
+        <w:t>Comparing composed melody and solo development between "Cosmic Rays" and "Bluebird."</w:t>
+      </w:r>
+    </w:p>
+    <w:p>
+      <w:pPr>
+        <w:spacing w:before="0" w:after="0"/>
+        <w:jc w:val="both"/>
+      </w:pPr>
     </w:p>
     <w:p>
       <w:pPr>
@@ -6034,8 +6172,80 @@
           <w:rFonts w:ascii="Times New Roman" w:hAnsi="Times New Roman"/>
           <w:sz w:val="20"/>
         </w:rPr>
-        <w:t>. We use this term, which is our own and is not standard in the literature, for a performance in which the series alternates between two well-separated levels rather than varying continuously around a central tendency: complexity holds at a low plateau, drops or leaps abruptly to the other level, and returns, as though passing through a door in the floor. The signature is high volatility combined with high lag-1 autocorrelation, since each level persists for several phrases once entered. Unlike other tunes, where volatility rises with mean complexity, "My Little Suede Shoes" achieves high volatility through this alternation rather than through sustained complexity (Figure 11).</w:t>
-      </w:r>
+        <w:t>. We use this term, which is our own and is not standard in the literature, for a performance in which the series alternates between two well-separated levels rather than varying continuously around a central tendency: complexity holds at a low plateau, drops or leaps abruptly to the other level, and returns, as though passing through a door in the floor. The signature is high volatility combined with high lag-1 autocorrelation, since each level persists for several phrases once entered. Unlike other tunes, where volatility rises with mean complexity, "My Little Suede Shoes" achieves high volatility through this alternation rather than through sustained complexity (Figure 7).</w:t>
+      </w:r>
+    </w:p>
+    <w:p>
+      <w:pPr>
+        <w:spacing w:before="0" w:after="0"/>
+        <w:jc w:val="both"/>
+      </w:pPr>
+    </w:p>
+    <w:p>
+      <w:pPr>
+        <w:jc w:val="center"/>
+      </w:pPr>
+      <w:r>
+        <w:drawing>
+          <wp:inline xmlns:a="http://schemas.openxmlformats.org/drawingml/2006/main" xmlns:pic="http://schemas.openxmlformats.org/drawingml/2006/picture">
+            <wp:extent cx="5029200" cy="3143250"/>
+            <wp:docPr id="7" name="Picture 7"/>
+            <wp:cNvGraphicFramePr>
+              <a:graphicFrameLocks noChangeAspect="1"/>
+            </wp:cNvGraphicFramePr>
+            <a:graphic>
+              <a:graphicData uri="http://schemas.openxmlformats.org/drawingml/2006/picture">
+                <pic:pic>
+                  <pic:nvPicPr>
+                    <pic:cNvPr id="0" name="fig_9.png"/>
+                    <pic:cNvPicPr/>
+                  </pic:nvPicPr>
+                  <pic:blipFill>
+                    <a:blip r:embed="rId23"/>
+                    <a:stretch>
+                      <a:fillRect/>
+                    </a:stretch>
+                  </pic:blipFill>
+                  <pic:spPr>
+                    <a:xfrm>
+                      <a:off x="0" y="0"/>
+                      <a:ext cx="5029200" cy="3143250"/>
+                    </a:xfrm>
+                    <a:prstGeom prst="rect"/>
+                  </pic:spPr>
+                </pic:pic>
+              </a:graphicData>
+            </a:graphic>
+          </wp:inline>
+        </w:drawing>
+      </w:r>
+    </w:p>
+    <w:p>
+      <w:pPr>
+        <w:spacing w:before="120" w:after="120"/>
+        <w:jc w:val="both"/>
+      </w:pPr>
+      <w:r>
+        <w:rPr>
+          <w:rFonts w:ascii="Times New Roman" w:hAnsi="Times New Roman"/>
+          <w:b/>
+          <w:sz w:val="20"/>
+        </w:rPr>
+        <w:t xml:space="preserve">Fig. 7. </w:t>
+      </w:r>
+      <w:r>
+        <w:rPr>
+          <w:rFonts w:ascii="Times New Roman" w:hAnsi="Times New Roman"/>
+          <w:sz w:val="20"/>
+        </w:rPr>
+        <w:t>The outlier "My Little Suede Shoes" showing extreme alternation between simple and complex passages.</w:t>
+      </w:r>
+    </w:p>
+    <w:p>
+      <w:pPr>
+        <w:spacing w:before="0" w:after="0"/>
+        <w:jc w:val="both"/>
+      </w:pPr>
     </w:p>
     <w:p>
       <w:pPr>
@@ -7040,7 +7250,7 @@
           <w:rFonts w:ascii="Times New Roman" w:hAnsi="Times New Roman"/>
           <w:sz w:val="20"/>
         </w:rPr>
-        <w:t>These strategies are not claims about conscious performer choice but emergent properties of tune-specific temporal organization. Figure 5 shows how the four groups separate across the clustering features, and Figure 13 gives their autocorrelation profiles across lags 1–5, where the contrast between continuous development and alternation is clearest.</w:t>
+        <w:t>These strategies are not claims about conscious performer choice but emergent properties of tune-specific temporal organization. Figure 8 shows how the four groups separate across the clustering features, and Figure 13 gives their autocorrelation profiles across lags 1–5, where the contrast between continuous development and alternation is clearest.</w:t>
       </w:r>
     </w:p>
     <w:p>
@@ -7057,7 +7267,7 @@
         <w:drawing>
           <wp:inline xmlns:a="http://schemas.openxmlformats.org/drawingml/2006/main" xmlns:pic="http://schemas.openxmlformats.org/drawingml/2006/picture">
             <wp:extent cx="5029200" cy="3572300"/>
-            <wp:docPr id="5" name="Picture 5"/>
+            <wp:docPr id="8" name="Picture 8"/>
             <wp:cNvGraphicFramePr>
               <a:graphicFrameLocks noChangeAspect="1"/>
             </wp:cNvGraphicFramePr>
@@ -7069,7 +7279,7 @@
                     <pic:cNvPicPr/>
                   </pic:nvPicPr>
                   <pic:blipFill>
-                    <a:blip r:embed="rId21"/>
+                    <a:blip r:embed="rId24"/>
                     <a:stretch>
                       <a:fillRect/>
                     </a:stretch>
@@ -7099,7 +7309,7 @@
           <w:b/>
           <w:sz w:val="20"/>
         </w:rPr>
-        <w:t xml:space="preserve">Fig. 5. </w:t>
+        <w:t xml:space="preserve">Fig. 8. </w:t>
       </w:r>
       <w:r>
         <w:rPr>
@@ -7697,7 +7907,7 @@
           <w:rFonts w:ascii="Times New Roman" w:hAnsi="Times New Roman"/>
           <w:sz w:val="20"/>
         </w:rPr>
-        <w:t>This finding reframes improvisation not as uniformly spontaneous but as strategically variable: Parker selects organizational modes, reactive navigation vs. composed architecture vs. phrase-length modulation, appropriate to each tune's character and formal constraints. The "Exploratory" strategy's near-absence of phrase-level Granger causation (1 of 28 significant effects across 7 tunes) suggests that predetermined chorus-level planning can operate independently of local reactive processes. Figure 6 gives the significance rates for all four tests across the 46 tunes.</w:t>
+        <w:t>This finding reframes improvisation not as uniformly spontaneous but as strategically variable: Parker selects organizational modes, reactive navigation vs. composed architecture vs. phrase-length modulation, appropriate to each tune's character and formal constraints. The "Exploratory" strategy's near-absence of phrase-level Granger causation (1 of 28 significant effects across 7 tunes) suggests that predetermined chorus-level planning can operate independently of local reactive processes. Figure 9 gives the significance rates for all four tests across the 46 tunes.</w:t>
       </w:r>
     </w:p>
     <w:p>
@@ -7714,7 +7924,7 @@
         <w:drawing>
           <wp:inline xmlns:a="http://schemas.openxmlformats.org/drawingml/2006/main" xmlns:pic="http://schemas.openxmlformats.org/drawingml/2006/picture">
             <wp:extent cx="5029200" cy="2489228"/>
-            <wp:docPr id="6" name="Picture 6"/>
+            <wp:docPr id="9" name="Picture 9"/>
             <wp:cNvGraphicFramePr>
               <a:graphicFrameLocks noChangeAspect="1"/>
             </wp:cNvGraphicFramePr>
@@ -7726,7 +7936,7 @@
                     <pic:cNvPicPr/>
                   </pic:nvPicPr>
                   <pic:blipFill>
-                    <a:blip r:embed="rId22"/>
+                    <a:blip r:embed="rId25"/>
                     <a:stretch>
                       <a:fillRect/>
                     </a:stretch>
@@ -7756,7 +7966,7 @@
           <w:b/>
           <w:sz w:val="20"/>
         </w:rPr>
-        <w:t xml:space="preserve">Fig. 6. </w:t>
+        <w:t xml:space="preserve">Fig. 9. </w:t>
       </w:r>
       <w:r>
         <w:rPr>
@@ -7994,7 +8204,7 @@
           <w:rFonts w:ascii="Times New Roman" w:hAnsi="Times New Roman"/>
           <w:sz w:val="20"/>
         </w:rPr>
-        <w:t xml:space="preserve"> &lt; .001). This gradient demonstrates that triadic sparsity correlates systematically with Parker's usage preferences rather than occurring by chance. Figure 7 plots triadic content against usage frequency for all 165 interval vectors, showing that the relationship holds across the full range rather than only between the quartile extremes.</w:t>
+        <w:t xml:space="preserve"> &lt; .001). This gradient demonstrates that triadic sparsity correlates systematically with Parker's usage preferences rather than occurring by chance. Figure 10 plots triadic content against usage frequency for all 165 interval vectors, showing that the relationship holds across the full range rather than only between the quartile extremes.</w:t>
       </w:r>
     </w:p>
     <w:p>
@@ -8439,7 +8649,7 @@
         <w:drawing>
           <wp:inline xmlns:a="http://schemas.openxmlformats.org/drawingml/2006/main" xmlns:pic="http://schemas.openxmlformats.org/drawingml/2006/picture">
             <wp:extent cx="5029200" cy="3709811"/>
-            <wp:docPr id="7" name="Picture 7"/>
+            <wp:docPr id="10" name="Picture 10"/>
             <wp:cNvGraphicFramePr>
               <a:graphicFrameLocks noChangeAspect="1"/>
             </wp:cNvGraphicFramePr>
@@ -8451,7 +8661,7 @@
                     <pic:cNvPicPr/>
                   </pic:nvPicPr>
                   <pic:blipFill>
-                    <a:blip r:embed="rId23"/>
+                    <a:blip r:embed="rId26"/>
                     <a:stretch>
                       <a:fillRect/>
                     </a:stretch>
@@ -8481,7 +8691,7 @@
           <w:b/>
           <w:sz w:val="20"/>
         </w:rPr>
-        <w:t xml:space="preserve">Fig. 7. </w:t>
+        <w:t xml:space="preserve">Fig. 10. </w:t>
       </w:r>
       <w:r>
         <w:rPr>
@@ -11022,7 +11232,7 @@
         <w:drawing>
           <wp:inline xmlns:a="http://schemas.openxmlformats.org/drawingml/2006/main" xmlns:pic="http://schemas.openxmlformats.org/drawingml/2006/picture">
             <wp:extent cx="5029200" cy="13719886"/>
-            <wp:docPr id="8" name="Picture 8"/>
+            <wp:docPr id="11" name="Picture 11"/>
             <wp:cNvGraphicFramePr>
               <a:graphicFrameLocks noChangeAspect="1"/>
             </wp:cNvGraphicFramePr>
@@ -11034,7 +11244,7 @@
                     <pic:cNvPicPr/>
                   </pic:nvPicPr>
                   <pic:blipFill>
-                    <a:blip r:embed="rId24"/>
+                    <a:blip r:embed="rId27"/>
                     <a:stretch>
                       <a:fillRect/>
                     </a:stretch>
@@ -11064,7 +11274,7 @@
           <w:b/>
           <w:sz w:val="20"/>
         </w:rPr>
-        <w:t xml:space="preserve">Fig. 8. </w:t>
+        <w:t xml:space="preserve">Fig. 11. </w:t>
       </w:r>
       <w:r>
         <w:rPr>
@@ -11072,216 +11282,6 @@
           <w:sz w:val="20"/>
         </w:rPr>
         <w:t>After phrase detection, five parallel approaches examine temporal patterns at different scales: local dynamics (rolling windows), predictability (autocorrelation), strategies (clustering), directional prediction (Granger testing), and structural properties (robustness).</w:t>
-      </w:r>
-    </w:p>
-    <w:p>
-      <w:pPr>
-        <w:spacing w:before="0" w:after="0"/>
-        <w:jc w:val="both"/>
-      </w:pPr>
-    </w:p>
-    <w:p>
-      <w:pPr>
-        <w:jc w:val="center"/>
-      </w:pPr>
-      <w:r>
-        <w:drawing>
-          <wp:inline xmlns:a="http://schemas.openxmlformats.org/drawingml/2006/main" xmlns:pic="http://schemas.openxmlformats.org/drawingml/2006/picture">
-            <wp:extent cx="5029200" cy="2514600"/>
-            <wp:docPr id="9" name="Picture 9"/>
-            <wp:cNvGraphicFramePr>
-              <a:graphicFrameLocks noChangeAspect="1"/>
-            </wp:cNvGraphicFramePr>
-            <a:graphic>
-              <a:graphicData uri="http://schemas.openxmlformats.org/drawingml/2006/picture">
-                <pic:pic>
-                  <pic:nvPicPr>
-                    <pic:cNvPr id="0" name="fig_7.png"/>
-                    <pic:cNvPicPr/>
-                  </pic:nvPicPr>
-                  <pic:blipFill>
-                    <a:blip r:embed="rId25"/>
-                    <a:stretch>
-                      <a:fillRect/>
-                    </a:stretch>
-                  </pic:blipFill>
-                  <pic:spPr>
-                    <a:xfrm>
-                      <a:off x="0" y="0"/>
-                      <a:ext cx="5029200" cy="2514600"/>
-                    </a:xfrm>
-                    <a:prstGeom prst="rect"/>
-                  </pic:spPr>
-                </pic:pic>
-              </a:graphicData>
-            </a:graphic>
-          </wp:inline>
-        </w:drawing>
-      </w:r>
-    </w:p>
-    <w:p>
-      <w:pPr>
-        <w:spacing w:before="120" w:after="120"/>
-        <w:jc w:val="both"/>
-      </w:pPr>
-      <w:r>
-        <w:rPr>
-          <w:rFonts w:ascii="Times New Roman" w:hAnsi="Times New Roman"/>
-          <w:b/>
-          <w:sz w:val="20"/>
-        </w:rPr>
-        <w:t xml:space="preserve">Fig. 9. </w:t>
-      </w:r>
-      <w:r>
-        <w:rPr>
-          <w:rFonts w:ascii="Times New Roman" w:hAnsi="Times New Roman"/>
-          <w:sz w:val="20"/>
-        </w:rPr>
-        <w:t>Cross-chorus complexity comparison showing head is simpler than improvised choruses.</w:t>
-      </w:r>
-    </w:p>
-    <w:p>
-      <w:pPr>
-        <w:spacing w:before="0" w:after="0"/>
-        <w:jc w:val="both"/>
-      </w:pPr>
-    </w:p>
-    <w:p>
-      <w:pPr>
-        <w:spacing w:before="0" w:after="0"/>
-        <w:jc w:val="both"/>
-      </w:pPr>
-    </w:p>
-    <w:p>
-      <w:pPr>
-        <w:jc w:val="center"/>
-      </w:pPr>
-      <w:r>
-        <w:drawing>
-          <wp:inline xmlns:a="http://schemas.openxmlformats.org/drawingml/2006/main" xmlns:pic="http://schemas.openxmlformats.org/drawingml/2006/picture">
-            <wp:extent cx="5029200" cy="3771900"/>
-            <wp:docPr id="10" name="Picture 10"/>
-            <wp:cNvGraphicFramePr>
-              <a:graphicFrameLocks noChangeAspect="1"/>
-            </wp:cNvGraphicFramePr>
-            <a:graphic>
-              <a:graphicData uri="http://schemas.openxmlformats.org/drawingml/2006/picture">
-                <pic:pic>
-                  <pic:nvPicPr>
-                    <pic:cNvPr id="0" name="fig_8.png"/>
-                    <pic:cNvPicPr/>
-                  </pic:nvPicPr>
-                  <pic:blipFill>
-                    <a:blip r:embed="rId26"/>
-                    <a:stretch>
-                      <a:fillRect/>
-                    </a:stretch>
-                  </pic:blipFill>
-                  <pic:spPr>
-                    <a:xfrm>
-                      <a:off x="0" y="0"/>
-                      <a:ext cx="5029200" cy="3771900"/>
-                    </a:xfrm>
-                    <a:prstGeom prst="rect"/>
-                  </pic:spPr>
-                </pic:pic>
-              </a:graphicData>
-            </a:graphic>
-          </wp:inline>
-        </w:drawing>
-      </w:r>
-    </w:p>
-    <w:p>
-      <w:pPr>
-        <w:spacing w:before="120" w:after="120"/>
-        <w:jc w:val="both"/>
-      </w:pPr>
-      <w:r>
-        <w:rPr>
-          <w:rFonts w:ascii="Times New Roman" w:hAnsi="Times New Roman"/>
-          <w:b/>
-          <w:sz w:val="20"/>
-        </w:rPr>
-        <w:t xml:space="preserve">Fig. 10. </w:t>
-      </w:r>
-      <w:r>
-        <w:rPr>
-          <w:rFonts w:ascii="Times New Roman" w:hAnsi="Times New Roman"/>
-          <w:sz w:val="20"/>
-        </w:rPr>
-        <w:t>Comparing composed melody and solo development between "Cosmic Rays" and "Bluebird."</w:t>
-      </w:r>
-    </w:p>
-    <w:p>
-      <w:pPr>
-        <w:spacing w:before="0" w:after="0"/>
-        <w:jc w:val="both"/>
-      </w:pPr>
-    </w:p>
-    <w:p>
-      <w:pPr>
-        <w:spacing w:before="0" w:after="0"/>
-        <w:jc w:val="both"/>
-      </w:pPr>
-    </w:p>
-    <w:p>
-      <w:pPr>
-        <w:jc w:val="center"/>
-      </w:pPr>
-      <w:r>
-        <w:drawing>
-          <wp:inline xmlns:a="http://schemas.openxmlformats.org/drawingml/2006/main" xmlns:pic="http://schemas.openxmlformats.org/drawingml/2006/picture">
-            <wp:extent cx="5029200" cy="3143250"/>
-            <wp:docPr id="11" name="Picture 11"/>
-            <wp:cNvGraphicFramePr>
-              <a:graphicFrameLocks noChangeAspect="1"/>
-            </wp:cNvGraphicFramePr>
-            <a:graphic>
-              <a:graphicData uri="http://schemas.openxmlformats.org/drawingml/2006/picture">
-                <pic:pic>
-                  <pic:nvPicPr>
-                    <pic:cNvPr id="0" name="fig_9.png"/>
-                    <pic:cNvPicPr/>
-                  </pic:nvPicPr>
-                  <pic:blipFill>
-                    <a:blip r:embed="rId27"/>
-                    <a:stretch>
-                      <a:fillRect/>
-                    </a:stretch>
-                  </pic:blipFill>
-                  <pic:spPr>
-                    <a:xfrm>
-                      <a:off x="0" y="0"/>
-                      <a:ext cx="5029200" cy="3143250"/>
-                    </a:xfrm>
-                    <a:prstGeom prst="rect"/>
-                  </pic:spPr>
-                </pic:pic>
-              </a:graphicData>
-            </a:graphic>
-          </wp:inline>
-        </w:drawing>
-      </w:r>
-    </w:p>
-    <w:p>
-      <w:pPr>
-        <w:spacing w:before="120" w:after="120"/>
-        <w:jc w:val="both"/>
-      </w:pPr>
-      <w:r>
-        <w:rPr>
-          <w:rFonts w:ascii="Times New Roman" w:hAnsi="Times New Roman"/>
-          <w:b/>
-          <w:sz w:val="20"/>
-        </w:rPr>
-        <w:t xml:space="preserve">Fig. 11. </w:t>
-      </w:r>
-      <w:r>
-        <w:rPr>
-          <w:rFonts w:ascii="Times New Roman" w:hAnsi="Times New Roman"/>
-          <w:sz w:val="20"/>
-        </w:rPr>
-        <w:t>The outlier "My Little Suede Shoes" showing extreme alternation between simple and complex passages.</w:t>
       </w:r>
     </w:p>
     <w:p>

</xml_diff>

<commit_message>
Move the cross-chorus comparison to the appendix
Of the three figures returned to the body, this one restates numbers the text
already prints as a list (chorus 1 at 8.32, chorus 2 at 11.31, later choruses
10-11), so it carries no evidence the reader does not already have. The two
that do - the Cosmic Rays / Bluebird contours and the "My Little Suede Shoes"
outlier - stay inline, since each is the sole support for a claim the body makes.

Body now carries nine figures and the appendix four, renumbered throughout.

Co-Authored-By: Claude Opus 5 (1M context) <noreply@anthropic.com>
</commit_message>
<xml_diff>
--- a/EMR/Bird_Over_Time_EMR.docx
+++ b/EMR/Bird_Over_Time_EMR.docx
@@ -1476,7 +1476,7 @@
           <w:rFonts w:ascii="Times New Roman" w:hAnsi="Times New Roman"/>
           <w:sz w:val="20"/>
         </w:rPr>
-        <w:t>The resulting phrases are short. A phrase spans a median of 1 harmonic segment (M = 2.01, range 1–12), and 54.3% of phrases consist of a single segment while 74.6% consist of two or fewer. This follows from the interaction of two facts already stated: bebop phrasing is densely articulated with short rests, while segments are as long as the harmonic rhythm. A phrase that falls within one chord symbol therefore contributes a single observation, and for just over half the corpus the phrase-level series is effectively a subsampled segment-level series. Phrase-level results below should be read with this in mind: they describe organization at the scale of rest-delimited gestures, which in this repertoire is often the scale of one chord, and the phrase-level analyses are for that reason reported alongside rolling-window and chorus-level analyses rather than on their own. Figure 11 sets out the five analyses that proceed from the detected phrases and the scale each addresses.</w:t>
+        <w:t>The resulting phrases are short. A phrase spans a median of 1 harmonic segment (M = 2.01, range 1–12), and 54.3% of phrases consist of a single segment while 74.6% consist of two or fewer. This follows from the interaction of two facts already stated: bebop phrasing is densely articulated with short rests, while segments are as long as the harmonic rhythm. A phrase that falls within one chord symbol therefore contributes a single observation, and for just over half the corpus the phrase-level series is effectively a subsampled segment-level series. Phrase-level results below should be read with this in mind: they describe organization at the scale of rest-delimited gestures, which in this repertoire is often the scale of one chord, and the phrase-level analyses are for that reason reported alongside rolling-window and chorus-level analyses rather than on their own. Figure 10 sets out the five analyses that proceed from the detected phrases and the scale each addresses.</w:t>
       </w:r>
     </w:p>
     <w:p>
@@ -5694,8 +5694,28 @@
           <w:rFonts w:ascii="Times New Roman" w:hAnsi="Times New Roman"/>
           <w:sz w:val="20"/>
         </w:rPr>
-        <w:t xml:space="preserve"> likely reflects melodic construction prioritizing memorable contour and singability over maximal harmonic density. Heads establish the core vocabulary while maintaining thematic clarity; improvised choruses then explore denser harmonic regions enabled by the absence of melodic memorability constraints. Figure 4 compares mean complexity across chorus positions directly.</w:t>
-      </w:r>
+        <w:t xml:space="preserve"> likely reflects melodic construction prioritizing memorable contour and singability over maximal harmonic density. Heads establish the core vocabulary while maintaining thematic clarity; improvised choruses then explore denser harmonic regions enabled by the absence of melodic memorability constraints. Figure 11 compares mean complexity across chorus positions directly.</w:t>
+      </w:r>
+    </w:p>
+    <w:p>
+      <w:pPr>
+        <w:spacing w:before="0" w:after="0"/>
+        <w:ind w:firstLine="720"/>
+        <w:jc w:val="both"/>
+      </w:pPr>
+      <w:r>
+        <w:rPr>
+          <w:rFonts w:ascii="Times New Roman" w:hAnsi="Times New Roman"/>
+          <w:sz w:val="20"/>
+        </w:rPr>
+        <w:t>Parker's core harmonic vocabulary is largely established in Chorus 1, the composed head. Chorus 1 already contains 81.1% of all distinct interval vectors that appear anywhere in the corpus, Chorus 2 adds a further 16.5%, and Choruses 3 and later contribute 2.4% between them (Figure 4). This is a corpus-level statistic rather than a single performance: chorus numbers are assigned per tune by dividing measure position by form length (12 bars for blues, 32 otherwise), the distinct vectors occurring in each chorus position are pooled across all 46 MIDI-aligned tunes, and coverage is then accumulated across chorus positions. Temporal evolution thus reflects primarily the exploration of new pathways connecting existing harmonic nodes rather than progressive vocabulary expansion.</w:t>
+      </w:r>
+    </w:p>
+    <w:p>
+      <w:pPr>
+        <w:spacing w:before="0" w:after="0"/>
+        <w:jc w:val="both"/>
+      </w:pPr>
     </w:p>
     <w:p>
       <w:pPr>
@@ -5713,7 +5733,7 @@
               <a:graphicData uri="http://schemas.openxmlformats.org/drawingml/2006/picture">
                 <pic:pic>
                   <pic:nvPicPr>
-                    <pic:cNvPr id="0" name="fig_7.png"/>
+                    <pic:cNvPr id="0" name="fig_6.png"/>
                     <pic:cNvPicPr/>
                   </pic:nvPicPr>
                   <pic:blipFill>
@@ -5754,92 +5774,6 @@
           <w:rFonts w:ascii="Times New Roman" w:hAnsi="Times New Roman"/>
           <w:sz w:val="20"/>
         </w:rPr>
-        <w:t>Cross-chorus complexity comparison showing head is simpler than improvised choruses.</w:t>
-      </w:r>
-    </w:p>
-    <w:p>
-      <w:pPr>
-        <w:spacing w:before="0" w:after="0"/>
-        <w:jc w:val="both"/>
-      </w:pPr>
-    </w:p>
-    <w:p>
-      <w:pPr>
-        <w:spacing w:before="0" w:after="0"/>
-        <w:ind w:firstLine="720"/>
-        <w:jc w:val="both"/>
-      </w:pPr>
-      <w:r>
-        <w:rPr>
-          <w:rFonts w:ascii="Times New Roman" w:hAnsi="Times New Roman"/>
-          <w:sz w:val="20"/>
-        </w:rPr>
-        <w:t>Parker's core harmonic vocabulary is largely established in Chorus 1, the composed head. Chorus 1 already contains 81.1% of all distinct interval vectors that appear anywhere in the corpus, Chorus 2 adds a further 16.5%, and Choruses 3 and later contribute 2.4% between them (Figure 5). This is a corpus-level statistic rather than a single performance: chorus numbers are assigned per tune by dividing measure position by form length (12 bars for blues, 32 otherwise), the distinct vectors occurring in each chorus position are pooled across all 46 MIDI-aligned tunes, and coverage is then accumulated across chorus positions. Temporal evolution thus reflects primarily the exploration of new pathways connecting existing harmonic nodes rather than progressive vocabulary expansion.</w:t>
-      </w:r>
-    </w:p>
-    <w:p>
-      <w:pPr>
-        <w:spacing w:before="0" w:after="0"/>
-        <w:jc w:val="both"/>
-      </w:pPr>
-    </w:p>
-    <w:p>
-      <w:pPr>
-        <w:jc w:val="center"/>
-      </w:pPr>
-      <w:r>
-        <w:drawing>
-          <wp:inline xmlns:a="http://schemas.openxmlformats.org/drawingml/2006/main" xmlns:pic="http://schemas.openxmlformats.org/drawingml/2006/picture">
-            <wp:extent cx="5029200" cy="2514600"/>
-            <wp:docPr id="5" name="Picture 5"/>
-            <wp:cNvGraphicFramePr>
-              <a:graphicFrameLocks noChangeAspect="1"/>
-            </wp:cNvGraphicFramePr>
-            <a:graphic>
-              <a:graphicData uri="http://schemas.openxmlformats.org/drawingml/2006/picture">
-                <pic:pic>
-                  <pic:nvPicPr>
-                    <pic:cNvPr id="0" name="fig_6.png"/>
-                    <pic:cNvPicPr/>
-                  </pic:nvPicPr>
-                  <pic:blipFill>
-                    <a:blip r:embed="rId21"/>
-                    <a:stretch>
-                      <a:fillRect/>
-                    </a:stretch>
-                  </pic:blipFill>
-                  <pic:spPr>
-                    <a:xfrm>
-                      <a:off x="0" y="0"/>
-                      <a:ext cx="5029200" cy="2514600"/>
-                    </a:xfrm>
-                    <a:prstGeom prst="rect"/>
-                  </pic:spPr>
-                </pic:pic>
-              </a:graphicData>
-            </a:graphic>
-          </wp:inline>
-        </w:drawing>
-      </w:r>
-    </w:p>
-    <w:p>
-      <w:pPr>
-        <w:spacing w:before="120" w:after="120"/>
-        <w:jc w:val="both"/>
-      </w:pPr>
-      <w:r>
-        <w:rPr>
-          <w:rFonts w:ascii="Times New Roman" w:hAnsi="Times New Roman"/>
-          <w:b/>
-          <w:sz w:val="20"/>
-        </w:rPr>
-        <w:t xml:space="preserve">Fig. 5. </w:t>
-      </w:r>
-      <w:r>
-        <w:rPr>
-          <w:rFonts w:ascii="Times New Roman" w:hAnsi="Times New Roman"/>
-          <w:sz w:val="20"/>
-        </w:rPr>
         <w:t>Cumulative vocabulary coverage across chorus positions, pooled across the 46 MIDI-aligned tunes. Chorus 1 (the head) accounts for 81.1% of all distinct interval vectors in the corpus, Chorus 2 (the first improvised chorus) adds 16.5%, and Choruses 3–5 add 2.4% in total. The curves are flat over long stretches because each step adds only interval vectors not already seen: once the common vocabulary has appeared, most later segments repeat it and contribute nothing new.</w:t>
       </w:r>
     </w:p>
@@ -5966,7 +5900,7 @@
           <w:rFonts w:ascii="Times New Roman" w:hAnsi="Times New Roman"/>
           <w:sz w:val="20"/>
         </w:rPr>
-        <w:t>This finding suggests Parker conceives each tune's improvisational arc holistically rather than applying a single approach across all contexts. Figure 6 plots the two contours against one another, with the composed head shown alongside the improvised choruses in each case.</w:t>
+        <w:t>This finding suggests Parker conceives each tune's improvisational arc holistically rather than applying a single approach across all contexts. Figure 5 plots the two contours against one another, with the composed head shown alongside the improvised choruses in each case.</w:t>
       </w:r>
     </w:p>
     <w:p>
@@ -5983,7 +5917,7 @@
         <w:drawing>
           <wp:inline xmlns:a="http://schemas.openxmlformats.org/drawingml/2006/main" xmlns:pic="http://schemas.openxmlformats.org/drawingml/2006/picture">
             <wp:extent cx="5029200" cy="3771900"/>
-            <wp:docPr id="6" name="Picture 6"/>
+            <wp:docPr id="5" name="Picture 5"/>
             <wp:cNvGraphicFramePr>
               <a:graphicFrameLocks noChangeAspect="1"/>
             </wp:cNvGraphicFramePr>
@@ -5995,7 +5929,7 @@
                     <pic:cNvPicPr/>
                   </pic:nvPicPr>
                   <pic:blipFill>
-                    <a:blip r:embed="rId22"/>
+                    <a:blip r:embed="rId21"/>
                     <a:stretch>
                       <a:fillRect/>
                     </a:stretch>
@@ -6025,7 +5959,7 @@
           <w:b/>
           <w:sz w:val="20"/>
         </w:rPr>
-        <w:t xml:space="preserve">Fig. 6. </w:t>
+        <w:t xml:space="preserve">Fig. 5. </w:t>
       </w:r>
       <w:r>
         <w:rPr>
@@ -6172,7 +6106,7 @@
           <w:rFonts w:ascii="Times New Roman" w:hAnsi="Times New Roman"/>
           <w:sz w:val="20"/>
         </w:rPr>
-        <w:t>. We use this term, which is our own and is not standard in the literature, for a performance in which the series alternates between two well-separated levels rather than varying continuously around a central tendency: complexity holds at a low plateau, drops or leaps abruptly to the other level, and returns, as though passing through a door in the floor. The signature is high volatility combined with high lag-1 autocorrelation, since each level persists for several phrases once entered. Unlike other tunes, where volatility rises with mean complexity, "My Little Suede Shoes" achieves high volatility through this alternation rather than through sustained complexity (Figure 7).</w:t>
+        <w:t>. We use this term, which is our own and is not standard in the literature, for a performance in which the series alternates between two well-separated levels rather than varying continuously around a central tendency: complexity holds at a low plateau, drops or leaps abruptly to the other level, and returns, as though passing through a door in the floor. The signature is high volatility combined with high lag-1 autocorrelation, since each level persists for several phrases once entered. Unlike other tunes, where volatility rises with mean complexity, "My Little Suede Shoes" achieves high volatility through this alternation rather than through sustained complexity (Figure 6).</w:t>
       </w:r>
     </w:p>
     <w:p>
@@ -6189,7 +6123,7 @@
         <w:drawing>
           <wp:inline xmlns:a="http://schemas.openxmlformats.org/drawingml/2006/main" xmlns:pic="http://schemas.openxmlformats.org/drawingml/2006/picture">
             <wp:extent cx="5029200" cy="3143250"/>
-            <wp:docPr id="7" name="Picture 7"/>
+            <wp:docPr id="6" name="Picture 6"/>
             <wp:cNvGraphicFramePr>
               <a:graphicFrameLocks noChangeAspect="1"/>
             </wp:cNvGraphicFramePr>
@@ -6201,7 +6135,7 @@
                     <pic:cNvPicPr/>
                   </pic:nvPicPr>
                   <pic:blipFill>
-                    <a:blip r:embed="rId23"/>
+                    <a:blip r:embed="rId22"/>
                     <a:stretch>
                       <a:fillRect/>
                     </a:stretch>
@@ -6231,7 +6165,7 @@
           <w:b/>
           <w:sz w:val="20"/>
         </w:rPr>
-        <w:t xml:space="preserve">Fig. 7. </w:t>
+        <w:t xml:space="preserve">Fig. 6. </w:t>
       </w:r>
       <w:r>
         <w:rPr>
@@ -7250,7 +7184,7 @@
           <w:rFonts w:ascii="Times New Roman" w:hAnsi="Times New Roman"/>
           <w:sz w:val="20"/>
         </w:rPr>
-        <w:t>These strategies are not claims about conscious performer choice but emergent properties of tune-specific temporal organization. Figure 8 shows how the four groups separate across the clustering features, and Figure 13 gives their autocorrelation profiles across lags 1–5, where the contrast between continuous development and alternation is clearest.</w:t>
+        <w:t>These strategies are not claims about conscious performer choice but emergent properties of tune-specific temporal organization. Figure 7 shows how the four groups separate across the clustering features, and Figure 13 gives their autocorrelation profiles across lags 1–5, where the contrast between continuous development and alternation is clearest.</w:t>
       </w:r>
     </w:p>
     <w:p>
@@ -7267,7 +7201,7 @@
         <w:drawing>
           <wp:inline xmlns:a="http://schemas.openxmlformats.org/drawingml/2006/main" xmlns:pic="http://schemas.openxmlformats.org/drawingml/2006/picture">
             <wp:extent cx="5029200" cy="3572300"/>
-            <wp:docPr id="8" name="Picture 8"/>
+            <wp:docPr id="7" name="Picture 7"/>
             <wp:cNvGraphicFramePr>
               <a:graphicFrameLocks noChangeAspect="1"/>
             </wp:cNvGraphicFramePr>
@@ -7279,7 +7213,7 @@
                     <pic:cNvPicPr/>
                   </pic:nvPicPr>
                   <pic:blipFill>
-                    <a:blip r:embed="rId24"/>
+                    <a:blip r:embed="rId23"/>
                     <a:stretch>
                       <a:fillRect/>
                     </a:stretch>
@@ -7309,7 +7243,7 @@
           <w:b/>
           <w:sz w:val="20"/>
         </w:rPr>
-        <w:t xml:space="preserve">Fig. 8. </w:t>
+        <w:t xml:space="preserve">Fig. 7. </w:t>
       </w:r>
       <w:r>
         <w:rPr>
@@ -7907,7 +7841,7 @@
           <w:rFonts w:ascii="Times New Roman" w:hAnsi="Times New Roman"/>
           <w:sz w:val="20"/>
         </w:rPr>
-        <w:t>This finding reframes improvisation not as uniformly spontaneous but as strategically variable: Parker selects organizational modes, reactive navigation vs. composed architecture vs. phrase-length modulation, appropriate to each tune's character and formal constraints. The "Exploratory" strategy's near-absence of phrase-level Granger causation (1 of 28 significant effects across 7 tunes) suggests that predetermined chorus-level planning can operate independently of local reactive processes. Figure 9 gives the significance rates for all four tests across the 46 tunes.</w:t>
+        <w:t>This finding reframes improvisation not as uniformly spontaneous but as strategically variable: Parker selects organizational modes, reactive navigation vs. composed architecture vs. phrase-length modulation, appropriate to each tune's character and formal constraints. The "Exploratory" strategy's near-absence of phrase-level Granger causation (1 of 28 significant effects across 7 tunes) suggests that predetermined chorus-level planning can operate independently of local reactive processes. Figure 8 gives the significance rates for all four tests across the 46 tunes.</w:t>
       </w:r>
     </w:p>
     <w:p>
@@ -7924,7 +7858,7 @@
         <w:drawing>
           <wp:inline xmlns:a="http://schemas.openxmlformats.org/drawingml/2006/main" xmlns:pic="http://schemas.openxmlformats.org/drawingml/2006/picture">
             <wp:extent cx="5029200" cy="2489228"/>
-            <wp:docPr id="9" name="Picture 9"/>
+            <wp:docPr id="8" name="Picture 8"/>
             <wp:cNvGraphicFramePr>
               <a:graphicFrameLocks noChangeAspect="1"/>
             </wp:cNvGraphicFramePr>
@@ -7936,7 +7870,7 @@
                     <pic:cNvPicPr/>
                   </pic:nvPicPr>
                   <pic:blipFill>
-                    <a:blip r:embed="rId25"/>
+                    <a:blip r:embed="rId24"/>
                     <a:stretch>
                       <a:fillRect/>
                     </a:stretch>
@@ -7966,7 +7900,7 @@
           <w:b/>
           <w:sz w:val="20"/>
         </w:rPr>
-        <w:t xml:space="preserve">Fig. 9. </w:t>
+        <w:t xml:space="preserve">Fig. 8. </w:t>
       </w:r>
       <w:r>
         <w:rPr>
@@ -8204,7 +8138,7 @@
           <w:rFonts w:ascii="Times New Roman" w:hAnsi="Times New Roman"/>
           <w:sz w:val="20"/>
         </w:rPr>
-        <w:t xml:space="preserve"> &lt; .001). This gradient demonstrates that triadic sparsity correlates systematically with Parker's usage preferences rather than occurring by chance. Figure 10 plots triadic content against usage frequency for all 165 interval vectors, showing that the relationship holds across the full range rather than only between the quartile extremes.</w:t>
+        <w:t xml:space="preserve"> &lt; .001). This gradient demonstrates that triadic sparsity correlates systematically with Parker's usage preferences rather than occurring by chance. Figure 9 plots triadic content against usage frequency for all 165 interval vectors, showing that the relationship holds across the full range rather than only between the quartile extremes.</w:t>
       </w:r>
     </w:p>
     <w:p>
@@ -8649,7 +8583,7 @@
         <w:drawing>
           <wp:inline xmlns:a="http://schemas.openxmlformats.org/drawingml/2006/main" xmlns:pic="http://schemas.openxmlformats.org/drawingml/2006/picture">
             <wp:extent cx="5029200" cy="3709811"/>
-            <wp:docPr id="10" name="Picture 10"/>
+            <wp:docPr id="9" name="Picture 9"/>
             <wp:cNvGraphicFramePr>
               <a:graphicFrameLocks noChangeAspect="1"/>
             </wp:cNvGraphicFramePr>
@@ -8661,7 +8595,7 @@
                     <pic:cNvPicPr/>
                   </pic:nvPicPr>
                   <pic:blipFill>
-                    <a:blip r:embed="rId26"/>
+                    <a:blip r:embed="rId25"/>
                     <a:stretch>
                       <a:fillRect/>
                     </a:stretch>
@@ -8691,7 +8625,7 @@
           <w:b/>
           <w:sz w:val="20"/>
         </w:rPr>
-        <w:t xml:space="preserve">Fig. 10. </w:t>
+        <w:t xml:space="preserve">Fig. 9. </w:t>
       </w:r>
       <w:r>
         <w:rPr>
@@ -11232,7 +11166,7 @@
         <w:drawing>
           <wp:inline xmlns:a="http://schemas.openxmlformats.org/drawingml/2006/main" xmlns:pic="http://schemas.openxmlformats.org/drawingml/2006/picture">
             <wp:extent cx="5029200" cy="13719886"/>
-            <wp:docPr id="11" name="Picture 11"/>
+            <wp:docPr id="10" name="Picture 10"/>
             <wp:cNvGraphicFramePr>
               <a:graphicFrameLocks noChangeAspect="1"/>
             </wp:cNvGraphicFramePr>
@@ -11244,7 +11178,7 @@
                     <pic:cNvPicPr/>
                   </pic:nvPicPr>
                   <pic:blipFill>
-                    <a:blip r:embed="rId27"/>
+                    <a:blip r:embed="rId26"/>
                     <a:stretch>
                       <a:fillRect/>
                     </a:stretch>
@@ -11274,6 +11208,72 @@
           <w:b/>
           <w:sz w:val="20"/>
         </w:rPr>
+        <w:t xml:space="preserve">Fig. 10. </w:t>
+      </w:r>
+      <w:r>
+        <w:rPr>
+          <w:rFonts w:ascii="Times New Roman" w:hAnsi="Times New Roman"/>
+          <w:sz w:val="20"/>
+        </w:rPr>
+        <w:t>After phrase detection, five parallel approaches examine temporal patterns at different scales: local dynamics (rolling windows), predictability (autocorrelation), strategies (clustering), directional prediction (Granger testing), and structural properties (robustness).</w:t>
+      </w:r>
+    </w:p>
+    <w:p>
+      <w:pPr>
+        <w:spacing w:before="0" w:after="0"/>
+        <w:jc w:val="both"/>
+      </w:pPr>
+    </w:p>
+    <w:p>
+      <w:pPr>
+        <w:jc w:val="center"/>
+      </w:pPr>
+      <w:r>
+        <w:drawing>
+          <wp:inline xmlns:a="http://schemas.openxmlformats.org/drawingml/2006/main" xmlns:pic="http://schemas.openxmlformats.org/drawingml/2006/picture">
+            <wp:extent cx="5029200" cy="2514600"/>
+            <wp:docPr id="11" name="Picture 11"/>
+            <wp:cNvGraphicFramePr>
+              <a:graphicFrameLocks noChangeAspect="1"/>
+            </wp:cNvGraphicFramePr>
+            <a:graphic>
+              <a:graphicData uri="http://schemas.openxmlformats.org/drawingml/2006/picture">
+                <pic:pic>
+                  <pic:nvPicPr>
+                    <pic:cNvPr id="0" name="fig_7.png"/>
+                    <pic:cNvPicPr/>
+                  </pic:nvPicPr>
+                  <pic:blipFill>
+                    <a:blip r:embed="rId27"/>
+                    <a:stretch>
+                      <a:fillRect/>
+                    </a:stretch>
+                  </pic:blipFill>
+                  <pic:spPr>
+                    <a:xfrm>
+                      <a:off x="0" y="0"/>
+                      <a:ext cx="5029200" cy="2514600"/>
+                    </a:xfrm>
+                    <a:prstGeom prst="rect"/>
+                  </pic:spPr>
+                </pic:pic>
+              </a:graphicData>
+            </a:graphic>
+          </wp:inline>
+        </w:drawing>
+      </w:r>
+    </w:p>
+    <w:p>
+      <w:pPr>
+        <w:spacing w:before="120" w:after="120"/>
+        <w:jc w:val="both"/>
+      </w:pPr>
+      <w:r>
+        <w:rPr>
+          <w:rFonts w:ascii="Times New Roman" w:hAnsi="Times New Roman"/>
+          <w:b/>
+          <w:sz w:val="20"/>
+        </w:rPr>
         <w:t xml:space="preserve">Fig. 11. </w:t>
       </w:r>
       <w:r>
@@ -11281,7 +11281,7 @@
           <w:rFonts w:ascii="Times New Roman" w:hAnsi="Times New Roman"/>
           <w:sz w:val="20"/>
         </w:rPr>
-        <w:t>After phrase detection, five parallel approaches examine temporal patterns at different scales: local dynamics (rolling windows), predictability (autocorrelation), strategies (clustering), directional prediction (Granger testing), and structural properties (robustness).</w:t>
+        <w:t>Cross-chorus complexity comparison showing head is simpler than improvised choruses.</w:t>
       </w:r>
     </w:p>
     <w:p>

</xml_diff>

<commit_message>
Relabel the analysis-pipeline diagram
Reviewer 1 could not tell what the step "Match Rests to Harmonic Segments"
meant. The box now reads "Locate Each Rest in the Segment Sequence", and its
note spells out the fallback order in words rather than as "beat -> measure ->
previous".

Three other labels in the same diagram contradicted the revised text and are
updated with it: the p-value drops its leading zero, the clustering box names
Strategies 1-3 plus the outlier rather than "k=4 clusters", and the summary
line says Granger causation rather than Causality.

Rendered from pipeline2.html via headless Chrome at 2x and trimmed, so the
source of the figure stays editable alongside the manuscript.

Co-Authored-By: Claude Opus 5 (1M context) <noreply@anthropic.com>
</commit_message>
<xml_diff>
--- a/EMR/Bird_Over_Time_EMR.docx
+++ b/EMR/Bird_Over_Time_EMR.docx
@@ -11355,7 +11355,7 @@
       <w:r>
         <w:drawing>
           <wp:inline xmlns:a="http://schemas.openxmlformats.org/drawingml/2006/main" xmlns:pic="http://schemas.openxmlformats.org/drawingml/2006/picture">
-            <wp:extent cx="5029200" cy="13719886"/>
+            <wp:extent cx="5029200" cy="12060977"/>
             <wp:docPr id="10" name="Picture 10"/>
             <wp:cNvGraphicFramePr>
               <a:graphicFrameLocks noChangeAspect="1"/>
@@ -11364,7 +11364,7 @@
               <a:graphicData uri="http://schemas.openxmlformats.org/drawingml/2006/picture">
                 <pic:pic>
                   <pic:nvPicPr>
-                    <pic:cNvPr id="0" name="fig_4.png"/>
+                    <pic:cNvPr id="0" name="pipeline2.png"/>
                     <pic:cNvPicPr/>
                   </pic:nvPicPr>
                   <pic:blipFill>
@@ -11376,7 +11376,7 @@
                   <pic:spPr>
                     <a:xfrm>
                       <a:off x="0" y="0"/>
-                      <a:ext cx="5029200" cy="13719886"/>
+                      <a:ext cx="5029200" cy="12060977"/>
                     </a:xfrm>
                     <a:prstGeom prst="rect"/>
                   </pic:spPr>

</xml_diff>

<commit_message>
Set the metric definitions as real equation objects
Reviewer 1 asked for equation objects, naming the complexity definition on
p. 4 as the example; it had been running together as "ici" in flowed text.

The three metrics are now OMML, which Word and LibreOffice both render as
native equations: a summation with limits for complexity, subscripted terms
for dissonance, and a radical over a summation of squared differences with
sub- and superscripted terms for rate of change.

Verified rather than assumed. LibreOffice converts the manuscript to PDF
without error, and the rendered page shows the limits above and below the
summation sign, the radical spanning the sum, and every sub- and superscript
in place. The document is otherwise unchanged: 13 figure captions, 5 tables,
and every section heading present in the converted output.

Co-Authored-By: Claude Opus 5 (1M context) <noreply@anthropic.com>
</commit_message>
<xml_diff>
--- a/EMR/Bird_Over_Time_EMR.docx
+++ b/EMR/Bird_Over_Time_EMR.docx
@@ -1125,61 +1125,66 @@
     </w:p>
     <w:p>
       <w:pPr>
-        <w:spacing w:before="80" w:after="80"/>
+        <w:spacing w:before="120" w:after="120"/>
         <w:jc w:val="center"/>
       </w:pPr>
-      <w:r>
-        <w:rPr>
-          <w:rFonts w:ascii="Times New Roman" w:hAnsi="Times New Roman"/>
-          <w:sz w:val="20"/>
-        </w:rPr>
-        <w:t xml:space="preserve">complexity = </w:t>
-      </w:r>
-      <w:r>
-        <w:rPr>
-          <w:rFonts w:ascii="Times New Roman" w:hAnsi="Times New Roman"/>
-          <w:sz w:val="20"/>
-        </w:rPr>
-        <w:t>Σ</w:t>
-      </w:r>
-      <w:r>
-        <w:rPr>
-          <w:rFonts w:ascii="Times New Roman" w:hAnsi="Times New Roman"/>
-          <w:sz w:val="20"/>
-        </w:rPr>
-        <w:t xml:space="preserve"> ic</w:t>
-      </w:r>
-      <w:r>
-        <w:rPr>
-          <w:rFonts w:ascii="Times New Roman" w:hAnsi="Times New Roman"/>
-          <w:i/>
-          <w:sz w:val="20"/>
-          <w:vertAlign w:val="subscript"/>
-        </w:rPr>
-        <w:t>i</w:t>
-      </w:r>
-      <w:r>
-        <w:rPr>
-          <w:rFonts w:ascii="Times New Roman" w:hAnsi="Times New Roman"/>
-          <w:sz w:val="20"/>
-        </w:rPr>
-        <w:t xml:space="preserve">   for </w:t>
-      </w:r>
-      <w:r>
-        <w:rPr>
-          <w:rFonts w:ascii="Times New Roman" w:hAnsi="Times New Roman"/>
-          <w:i/>
-          <w:sz w:val="20"/>
-        </w:rPr>
-        <w:t>i</w:t>
-      </w:r>
-      <w:r>
-        <w:rPr>
-          <w:rFonts w:ascii="Times New Roman" w:hAnsi="Times New Roman"/>
-          <w:sz w:val="20"/>
-        </w:rPr>
-        <w:t xml:space="preserve"> = 1 to 6</w:t>
-      </w:r>
+      <m:oMath>
+        <m:r>
+          <m:rPr>
+            <m:sty m:val="p"/>
+          </m:rPr>
+          <m:t xml:space="preserve">complexity = </m:t>
+        </m:r>
+        <m:nary>
+          <m:naryPr>
+            <m:chr m:val="∑"/>
+            <m:limLoc m:val="undOvr"/>
+            <m:ctrlPr/>
+          </m:naryPr>
+          <m:sub>
+            <m:r>
+              <m:t xml:space="preserve">i</m:t>
+            </m:r>
+            <m:r>
+              <m:rPr>
+                <m:sty m:val="p"/>
+              </m:rPr>
+              <m:t xml:space="preserve">=</m:t>
+            </m:r>
+            <m:r>
+              <m:rPr>
+                <m:sty m:val="p"/>
+              </m:rPr>
+              <m:t xml:space="preserve">1</m:t>
+            </m:r>
+          </m:sub>
+          <m:sup>
+            <m:r>
+              <m:rPr>
+                <m:sty m:val="p"/>
+              </m:rPr>
+              <m:t xml:space="preserve">6</m:t>
+            </m:r>
+          </m:sup>
+          <m:e>
+            <m:sSub>
+              <m:e>
+                <m:r>
+                  <m:rPr>
+                    <m:sty m:val="p"/>
+                  </m:rPr>
+                  <m:t xml:space="preserve">ic</m:t>
+                </m:r>
+              </m:e>
+              <m:sub>
+                <m:r>
+                  <m:t xml:space="preserve">i</m:t>
+                </m:r>
+              </m:sub>
+            </m:sSub>
+          </m:e>
+        </m:nary>
+      </m:oMath>
     </w:p>
     <w:p>
       <w:pPr>
@@ -1212,54 +1217,74 @@
     </w:p>
     <w:p>
       <w:pPr>
-        <w:spacing w:before="80" w:after="80"/>
+        <w:spacing w:before="120" w:after="120"/>
         <w:jc w:val="center"/>
       </w:pPr>
-      <w:r>
-        <w:rPr>
-          <w:rFonts w:ascii="Times New Roman" w:hAnsi="Times New Roman"/>
-          <w:sz w:val="20"/>
-        </w:rPr>
-        <w:t>dissonance = ic</w:t>
-      </w:r>
-      <w:r>
-        <w:rPr>
-          <w:rFonts w:ascii="Times New Roman" w:hAnsi="Times New Roman"/>
-          <w:sz w:val="20"/>
-          <w:vertAlign w:val="subscript"/>
-        </w:rPr>
-        <w:t>1</w:t>
-      </w:r>
-      <w:r>
-        <w:rPr>
-          <w:rFonts w:ascii="Times New Roman" w:hAnsi="Times New Roman"/>
-          <w:sz w:val="20"/>
-        </w:rPr>
-        <w:t xml:space="preserve"> + 0.5 × ic</w:t>
-      </w:r>
-      <w:r>
-        <w:rPr>
-          <w:rFonts w:ascii="Times New Roman" w:hAnsi="Times New Roman"/>
-          <w:sz w:val="20"/>
-          <w:vertAlign w:val="subscript"/>
-        </w:rPr>
-        <w:t>2</w:t>
-      </w:r>
-      <w:r>
-        <w:rPr>
-          <w:rFonts w:ascii="Times New Roman" w:hAnsi="Times New Roman"/>
-          <w:sz w:val="20"/>
-        </w:rPr>
-        <w:t xml:space="preserve"> + 0.8 × ic</w:t>
-      </w:r>
-      <w:r>
-        <w:rPr>
-          <w:rFonts w:ascii="Times New Roman" w:hAnsi="Times New Roman"/>
-          <w:sz w:val="20"/>
-          <w:vertAlign w:val="subscript"/>
-        </w:rPr>
-        <w:t>6</w:t>
-      </w:r>
+      <m:oMath>
+        <m:r>
+          <m:rPr>
+            <m:sty m:val="p"/>
+          </m:rPr>
+          <m:t xml:space="preserve">dissonance = </m:t>
+        </m:r>
+        <m:sSub>
+          <m:e>
+            <m:r>
+              <m:rPr>
+                <m:sty m:val="p"/>
+              </m:rPr>
+              <m:t xml:space="preserve">ic</m:t>
+            </m:r>
+          </m:e>
+          <m:sub>
+            <m:r>
+              <m:t xml:space="preserve">1</m:t>
+            </m:r>
+          </m:sub>
+        </m:sSub>
+        <m:r>
+          <m:rPr>
+            <m:sty m:val="p"/>
+          </m:rPr>
+          <m:t xml:space="preserve"> + 0.5 ∙ </m:t>
+        </m:r>
+        <m:sSub>
+          <m:e>
+            <m:r>
+              <m:rPr>
+                <m:sty m:val="p"/>
+              </m:rPr>
+              <m:t xml:space="preserve">ic</m:t>
+            </m:r>
+          </m:e>
+          <m:sub>
+            <m:r>
+              <m:t xml:space="preserve">2</m:t>
+            </m:r>
+          </m:sub>
+        </m:sSub>
+        <m:r>
+          <m:rPr>
+            <m:sty m:val="p"/>
+          </m:rPr>
+          <m:t xml:space="preserve"> + 0.8 ∙ </m:t>
+        </m:r>
+        <m:sSub>
+          <m:e>
+            <m:r>
+              <m:rPr>
+                <m:sty m:val="p"/>
+              </m:rPr>
+              <m:t xml:space="preserve">ic</m:t>
+            </m:r>
+          </m:e>
+          <m:sub>
+            <m:r>
+              <m:t xml:space="preserve">6</m:t>
+            </m:r>
+          </m:sub>
+        </m:sSub>
+      </m:oMath>
     </w:p>
     <w:p>
       <w:pPr>
@@ -1320,114 +1345,133 @@
     </w:p>
     <w:p>
       <w:pPr>
-        <w:spacing w:before="80" w:after="80"/>
+        <w:spacing w:before="120" w:after="120"/>
         <w:jc w:val="center"/>
       </w:pPr>
-      <w:r>
-        <w:rPr>
-          <w:rFonts w:ascii="Times New Roman" w:hAnsi="Times New Roman"/>
-          <w:sz w:val="20"/>
-        </w:rPr>
-        <w:t xml:space="preserve">rate of change = √[ </w:t>
-      </w:r>
-      <w:r>
-        <w:rPr>
-          <w:rFonts w:ascii="Times New Roman" w:hAnsi="Times New Roman"/>
-          <w:sz w:val="20"/>
-        </w:rPr>
-        <w:t>Σ</w:t>
-      </w:r>
-      <w:r>
-        <w:rPr>
-          <w:rFonts w:ascii="Times New Roman" w:hAnsi="Times New Roman"/>
-          <w:sz w:val="20"/>
-        </w:rPr>
-        <w:t xml:space="preserve"> (ic</w:t>
-      </w:r>
-      <w:r>
-        <w:rPr>
-          <w:rFonts w:ascii="Times New Roman" w:hAnsi="Times New Roman"/>
-          <w:i/>
-          <w:sz w:val="20"/>
-          <w:vertAlign w:val="subscript"/>
-        </w:rPr>
-        <w:t>i</w:t>
-      </w:r>
-      <w:r>
-        <w:rPr>
-          <w:rFonts w:ascii="Times New Roman" w:hAnsi="Times New Roman"/>
-          <w:sz w:val="20"/>
-        </w:rPr>
-        <w:t>(</w:t>
-      </w:r>
-      <w:r>
-        <w:rPr>
-          <w:rFonts w:ascii="Times New Roman" w:hAnsi="Times New Roman"/>
-          <w:i/>
-          <w:sz w:val="20"/>
-        </w:rPr>
-        <w:t>t</w:t>
-      </w:r>
-      <w:r>
-        <w:rPr>
-          <w:rFonts w:ascii="Times New Roman" w:hAnsi="Times New Roman"/>
-          <w:sz w:val="20"/>
-        </w:rPr>
-        <w:t xml:space="preserve"> + 1) − ic</w:t>
-      </w:r>
-      <w:r>
-        <w:rPr>
-          <w:rFonts w:ascii="Times New Roman" w:hAnsi="Times New Roman"/>
-          <w:i/>
-          <w:sz w:val="20"/>
-          <w:vertAlign w:val="subscript"/>
-        </w:rPr>
-        <w:t>i</w:t>
-      </w:r>
-      <w:r>
-        <w:rPr>
-          <w:rFonts w:ascii="Times New Roman" w:hAnsi="Times New Roman"/>
-          <w:sz w:val="20"/>
-        </w:rPr>
-        <w:t>(</w:t>
-      </w:r>
-      <w:r>
-        <w:rPr>
-          <w:rFonts w:ascii="Times New Roman" w:hAnsi="Times New Roman"/>
-          <w:i/>
-          <w:sz w:val="20"/>
-        </w:rPr>
-        <w:t>t</w:t>
-      </w:r>
-      <w:r>
-        <w:rPr>
-          <w:rFonts w:ascii="Times New Roman" w:hAnsi="Times New Roman"/>
-          <w:sz w:val="20"/>
-        </w:rPr>
-        <w:t>) )² ]</w:t>
-      </w:r>
-      <w:r>
-        <w:rPr>
-          <w:rFonts w:ascii="Times New Roman" w:hAnsi="Times New Roman"/>
-          <w:sz w:val="20"/>
-        </w:rPr>
-        <w:t xml:space="preserve">   for </w:t>
-      </w:r>
-      <w:r>
-        <w:rPr>
-          <w:rFonts w:ascii="Times New Roman" w:hAnsi="Times New Roman"/>
-          <w:i/>
-          <w:sz w:val="20"/>
-        </w:rPr>
-        <w:t>i</w:t>
-      </w:r>
-      <w:r>
-        <w:rPr>
-          <w:rFonts w:ascii="Times New Roman" w:hAnsi="Times New Roman"/>
-          <w:sz w:val="20"/>
-        </w:rPr>
-        <w:t xml:space="preserve"> = 1 to 6</w:t>
-      </w:r>
+      <m:oMath>
+        <m:r>
+          <m:rPr>
+            <m:sty m:val="p"/>
+          </m:rPr>
+          <m:t xml:space="preserve">rate of change = </m:t>
+        </m:r>
+        <m:rad>
+          <m:radPr>
+            <m:degHide m:val="1"/>
+            <m:ctrlPr/>
+          </m:radPr>
+          <m:deg/>
+          <m:e>
+            <m:nary>
+              <m:naryPr>
+                <m:chr m:val="∑"/>
+                <m:limLoc m:val="undOvr"/>
+                <m:ctrlPr/>
+              </m:naryPr>
+              <m:sub>
+                <m:r>
+                  <m:t xml:space="preserve">i</m:t>
+                </m:r>
+                <m:r>
+                  <m:rPr>
+                    <m:sty m:val="p"/>
+                  </m:rPr>
+                  <m:t xml:space="preserve">=</m:t>
+                </m:r>
+                <m:r>
+                  <m:rPr>
+                    <m:sty m:val="p"/>
+                  </m:rPr>
+                  <m:t xml:space="preserve">1</m:t>
+                </m:r>
+              </m:sub>
+              <m:sup>
+                <m:r>
+                  <m:rPr>
+                    <m:sty m:val="p"/>
+                  </m:rPr>
+                  <m:t xml:space="preserve">6</m:t>
+                </m:r>
+              </m:sup>
+              <m:e>
+                <m:sSup>
+                  <m:e>
+                    <m:d>
+                      <m:dPr>
+                        <m:begChr m:val="("/>
+                        <m:endChr m:val=")"/>
+                        <m:ctrlPr/>
+                      </m:dPr>
+                      <m:e>
+                        <m:sSubSup>
+                          <m:e>
+                            <m:r>
+                              <m:rPr>
+                                <m:sty m:val="p"/>
+                              </m:rPr>
+                              <m:t xml:space="preserve">ic</m:t>
+                            </m:r>
+                          </m:e>
+                          <m:sub>
+                            <m:r>
+                              <m:t xml:space="preserve">i</m:t>
+                            </m:r>
+                          </m:sub>
+                          <m:sup>
+                            <m:r>
+                              <m:rPr>
+                                <m:sty m:val="p"/>
+                              </m:rPr>
+                              <m:t xml:space="preserve">t+1</m:t>
+                            </m:r>
+                          </m:sup>
+                        </m:sSubSup>
+                        <m:r>
+                          <m:rPr>
+                            <m:sty m:val="p"/>
+                          </m:rPr>
+                          <m:t xml:space="preserve"> − </m:t>
+                        </m:r>
+                        <m:sSubSup>
+                          <m:e>
+                            <m:r>
+                              <m:rPr>
+                                <m:sty m:val="p"/>
+                              </m:rPr>
+                              <m:t xml:space="preserve">ic</m:t>
+                            </m:r>
+                          </m:e>
+                          <m:sub>
+                            <m:r>
+                              <m:t xml:space="preserve">i</m:t>
+                            </m:r>
+                          </m:sub>
+                          <m:sup>
+                            <m:r>
+                              <m:rPr>
+                                <m:sty m:val="p"/>
+                              </m:rPr>
+                              <m:t xml:space="preserve">t</m:t>
+                            </m:r>
+                          </m:sup>
+                        </m:sSubSup>
+                      </m:e>
+                    </m:d>
+                  </m:e>
+                  <m:sup>
+                    <m:r>
+                      <m:rPr>
+                        <m:sty m:val="p"/>
+                      </m:rPr>
+                      <m:t xml:space="preserve">2</m:t>
+                    </m:r>
+                  </m:sup>
+                </m:sSup>
+              </m:e>
+            </m:nary>
+          </m:e>
+        </m:rad>
+      </m:oMath>
     </w:p>
     <w:p>
       <w:pPr>

</xml_diff>

<commit_message>
Retire the last of the undefined terms
A sweep against Reviewer 2's list found several survivors of the earlier pass.
"Surface articulation" remained in three places in the Discussion and
Conclusion, and "positional centrality" in one, both of which he singled out as
meaningless to an outside reader. "Harmonic content" and "harmonic material"
also persisted, against the paper's own rule that "harmonic" refers only to the
underlying progression; these are now "intervallic content" or a direct
reference to the chord.

Two synonym pairs he asked us to collapse are collapsed: "variability" gives
way to "volatility", which the Methodology defines, and the one stray "harmonic
complexity" in Results becomes "complexity". The title keeps the longer form,
and the Introduction keeps it where it names the research literature on that
construct rather than our own measure.

Co-Authored-By: Claude Opus 5 (1M context) <noreply@anthropic.com>
</commit_message>
<xml_diff>
--- a/EMR/Bird_Over_Time_EMR.docx
+++ b/EMR/Bird_Over_Time_EMR.docx
@@ -165,7 +165,7 @@
           <w:rFonts w:ascii="Times New Roman" w:hAnsi="Times New Roman"/>
           <w:sz w:val="20"/>
         </w:rPr>
-        <w:t xml:space="preserve">In most performances, what Parker played in one phrase does not help predict the next: in 80.4% of solos, dissonance carries no predictive information about the complexity that follows, or the reverse. Phrase-to-phrase reaction is therefore the exception, and organization above the phrase, at the level of the chorus, appears to be the rule. Clustering the solos on their complexity, variability and predictability yields three groups that differ in exactly this respect: the group we call Exploratory shows almost no phrase-to-phrase prediction (3.6%), the Balanced group a moderate amount (11.0%), and the Contrasting group organizes itself through phrase duration instead (23.1%). Where prediction does hold, it runs more often from dissonance to subsequent complexity than the </w:t>
+        <w:t xml:space="preserve">In most performances, what Parker played in one phrase does not help predict the next: in 80.4% of solos, dissonance carries no predictive information about the complexity that follows, or the reverse. Phrase-to-phrase reaction is therefore the exception, and organization above the phrase, at the level of the chorus, appears to be the rule. Clustering the solos on their complexity, volatility and predictability yields three groups that differ in exactly this respect: the group we call Exploratory shows almost no phrase-to-phrase prediction (3.6%), the Balanced group a moderate amount (11.0%), and the Contrasting group organizes itself through phrase duration instead (23.1%). Where prediction does hold, it runs more often from dissonance to subsequent complexity than the </w:t>
       </w:r>
       <w:r>
         <w:rPr>
@@ -1013,7 +1013,7 @@
           <w:rFonts w:ascii="Times New Roman" w:hAnsi="Times New Roman"/>
           <w:sz w:val="20"/>
         </w:rPr>
-        <w:t>For each chord change in the corpus, we extract all pitch classes sounding over that harmonic moment and compute the interval vector. The interval vector is a six-dimensional vector (ic₁, ic₂, ic₃, ic₄, ic₅, ic₆) where each component counts occurrences of each interval class. This abstracts away from register and specific voicing while preserving harmonic content. Successive interval vectors, aligned with their MIDI timestamps, create a time series representation of harmonic evolution. This enables standard time series analysis techniques while maintaining musical relevance: interval vectors capture harmonic information essential to jazz theory. Figure 2 shows the three resulting series for a single performance, "Confirmation", with all three metrics normalized to a common scale so that their joint behavior is visible.</w:t>
+        <w:t>For each chord change in the corpus, we extract all pitch classes sounding over that harmonic moment and compute the interval vector. The interval vector is a six-dimensional vector (ic₁, ic₂, ic₃, ic₄, ic₅, ic₆) where each component counts occurrences of each interval class. This abstracts away from register and specific voicing while preserving intervallic content. Successive interval vectors, aligned with their MIDI timestamps, create a time series representation of harmonic evolution. This enables standard time series analysis techniques while maintaining musical relevance: interval vectors capture harmonic information essential to jazz theory. Figure 2 shows the three resulting series for a single performance, "Confirmation", with all three metrics normalized to a common scale so that their joint behavior is visible.</w:t>
       </w:r>
     </w:p>
     <w:p>
@@ -2865,14 +2865,14 @@
           <w:b/>
           <w:sz w:val="20"/>
         </w:rPr>
-        <w:t>positional centrality</w:t>
-      </w:r>
-      <w:r>
-        <w:rPr>
-          <w:rFonts w:ascii="Times New Roman" w:hAnsi="Times New Roman"/>
-          <w:sz w:val="20"/>
-        </w:rPr>
-        <w:t>, offering maximum continuation options to diverse harmonic destinations. This observation motivates our subsequent time series analysis, which examines how Parker deploys this core vocabulary across temporal scales from phrase-level articulation to full-chorus development arcs.</w:t>
+        <w:t>position in that network</w:t>
+      </w:r>
+      <w:r>
+        <w:rPr>
+          <w:rFonts w:ascii="Times New Roman" w:hAnsi="Times New Roman"/>
+          <w:sz w:val="20"/>
+        </w:rPr>
+        <w:t xml:space="preserve"> rather than any stability of its own. This observation motivates our subsequent time series analysis, which examines how Parker deploys this core vocabulary across temporal scales from phrase-level articulation to full-chorus development arcs.</w:t>
       </w:r>
     </w:p>
     <w:p>
@@ -5464,7 +5464,7 @@
           <w:rFonts w:ascii="Times New Roman" w:hAnsi="Times New Roman"/>
           <w:sz w:val="20"/>
         </w:rPr>
-        <w:t xml:space="preserve">Analysis of 3,371 segments across 50 tunes reveals wide variation in harmonic complexity (Figure 3). Mean </w:t>
+        <w:t xml:space="preserve">Analysis of 3,371 segments across 50 tunes reveals wide variation in complexity (Figure 3). Mean </w:t>
       </w:r>
       <w:r>
         <w:rPr>
@@ -5620,7 +5620,7 @@
           <w:rFonts w:ascii="Times New Roman" w:hAnsi="Times New Roman"/>
           <w:sz w:val="20"/>
         </w:rPr>
-        <w:t>Importantly, complexity and variability correlate strongly (</w:t>
+        <w:t>Importantly, complexity and volatility correlate strongly (</w:t>
       </w:r>
       <w:r>
         <w:rPr>
@@ -6268,7 +6268,7 @@
           <w:rFonts w:ascii="Times New Roman" w:hAnsi="Times New Roman"/>
           <w:sz w:val="20"/>
         </w:rPr>
-        <w:t>• Highest complexity variability: CV = 0.99</w:t>
+        <w:t>• Highest complexity volatility: CV = 0.99</w:t>
       </w:r>
     </w:p>
     <w:p>
@@ -6282,7 +6282,7 @@
           <w:rFonts w:ascii="Times New Roman" w:hAnsi="Times New Roman"/>
           <w:sz w:val="20"/>
         </w:rPr>
-        <w:t>• Highest dissonance variability: CV = 1.37</w:t>
+        <w:t>• Highest dissonance volatility: CV = 1.37</w:t>
       </w:r>
     </w:p>
     <w:p>
@@ -6726,7 +6726,7 @@
           <w:rFonts w:ascii="Times New Roman" w:hAnsi="Times New Roman"/>
           <w:sz w:val="20"/>
         </w:rPr>
-        <w:t>▸ Characteristics: Phrase t negatively predicts phrase t + 1: Parker alternates between contrasting harmonic materials rather than developing continuously. The alternation itself is consistent, even though the direction of each move is not.</w:t>
+        <w:t>▸ Characteristics: Phrase t negatively predicts phrase t + 1: Parker alternates between contrasting material rather than developing continuously. The alternation itself is consistent, even though the direction of each move is not.</w:t>
       </w:r>
     </w:p>
     <w:p>
@@ -9092,7 +9092,7 @@
           <w:rFonts w:ascii="Times New Roman" w:hAnsi="Times New Roman"/>
           <w:sz w:val="20"/>
         </w:rPr>
-        <w:t>• Phrase level (surface articulation): consistently short across all tunes</w:t>
+        <w:t>• Phrase level (the rest-delimited gestures themselves): consistently short across all tunes</w:t>
       </w:r>
     </w:p>
     <w:p>
@@ -9434,7 +9434,7 @@
           <w:rFonts w:ascii="Times New Roman" w:hAnsi="Times New Roman"/>
           <w:sz w:val="20"/>
         </w:rPr>
-        <w:t>Rather than a single organizational mode (reactive vs. composed, spontaneous vs. planned), expert improvisers like Parker operate across a continuum, selecting organizational strategies appropriate to each performance. The term gravity captures this phenomenon: in some performances, harmonic tension exerts directional force on subsequent choices (reactive/algorithmic mode); in others, temporal organization proceeds independently of local conditions (composed/inspirational mode); in still others, phrase-length variation drives temporal structure independently of harmonic content (structural algorithm).</w:t>
+        <w:t>Rather than a single organizational mode (reactive vs. composed, spontaneous vs. planned), expert improvisers like Parker operate across a continuum, selecting organizational strategies appropriate to each performance. The term gravity captures this phenomenon: in some performances, harmonic tension exerts directional force on subsequent choices (reactive/algorithmic mode); in others, temporal organization proceeds independently of local conditions (composed/inspirational mode); in still others, phrase-length variation drives temporal structure independently of intervallic content (structural algorithm).</w:t>
       </w:r>
     </w:p>
     <w:p>
@@ -9512,7 +9512,7 @@
           <w:rFonts w:ascii="Times New Roman" w:hAnsi="Times New Roman"/>
           <w:sz w:val="20"/>
         </w:rPr>
-        <w:t xml:space="preserve"> &lt; .001) challenges fundamental assumptions about bebop harmony. Traditional harmony assumes triads provide stable foundations above which extensions are added. In jazz harmony, triads also make great "upper structure" to super-impose over harmonic material. Parker's practice reveals a different organizing principle: his most frequently deployed interval vectors are triadically sparse, not triadically rich.</w:t>
+        <w:t xml:space="preserve"> &lt; .001) challenges fundamental assumptions about bebop harmony. Traditional harmony assumes triads provide stable foundations above which extensions are added. In jazz harmony, triads also make great "upper structure" to super-impose over the underlying chord. Parker's practice reveals a different organizing principle: his most frequently deployed interval vectors are triadically sparse, not triadically rich.</w:t>
       </w:r>
     </w:p>
     <w:p>
@@ -9715,7 +9715,7 @@
           <w:rFonts w:ascii="Times New Roman" w:hAnsi="Times New Roman"/>
           <w:sz w:val="20"/>
         </w:rPr>
-        <w:t>, not individual phrases. This suggests Parker's improvisational conception operates primarily at phrase-group and chorus levels, with surface articulation following from these higher-level plans.</w:t>
+        <w:t>, not individual phrases. This suggests Parker's improvisational conception operates primarily at phrase-group and chorus levels, with the rest-delimited gestures following from these higher-level plans.</w:t>
       </w:r>
     </w:p>
     <w:p>
@@ -9953,7 +9953,7 @@
           <w:rFonts w:ascii="Times New Roman" w:hAnsi="Times New Roman"/>
           <w:sz w:val="20"/>
         </w:rPr>
-        <w:t>surface articulation (relatively brief phrases averaging 2 segments) organizes into phrase groups (5-phrase windows revealing meaningful patterns) organized by chorus-level strategic architecture, with different organizing principles operating at each temporal scale.</w:t>
+        <w:t>rest-delimited phrases (averaging 2 segments) organize into phrase groups (5-phrase windows revealing meaningful patterns) organized by chorus-level strategic architecture, with different organizing principles operating at each temporal scale.</w:t>
       </w:r>
     </w:p>
     <w:p>

</xml_diff>

<commit_message>
Add notated examples, and correct a miscounted one
Both reviewers asked for the method to be shown in notation rather than in
pitch-class names. One engraved figure now serves both requests: three bars over
a C7, showing the worked example whose interval vector the text computes, a
triadically sparse collection, and a triadically dense one. Engraved with
verovio from MusicXML, and the source is committed next to the image so the
figure stays editable.

Writing it caught an error. The text claimed {C, E, G, Bb} contains one complete
triad, C major. It contains two: C major and E diminished. The sparse example
has been replaced with {C, D, Eb, Bb}, which genuinely contains none, so the
contrast the sentence draws is now a real one - none, two, four - rather than an
understated count against a correct one.

Co-Authored-By: Claude Opus 5 (1M context) <noreply@anthropic.com>
</commit_message>
<xml_diff>
--- a/EMR/Bird_Over_Time_EMR.docx
+++ b/EMR/Bird_Over_Time_EMR.docx
@@ -1099,8 +1099,80 @@
           <w:rFonts w:ascii="Times New Roman" w:hAnsi="Times New Roman"/>
           <w:sz w:val="20"/>
         </w:rPr>
-        <w:t>We computed three metrics for each segment. A worked example runs through all three. Suppose that over one C7 chord Parker plays the notes C, E, G and B♭. Reduced to pitch classes these are {C, E, G, B♭}; the six pairs among them are C–E (4 semitones, ic4), C–G (5, ic5), C–B♭ (2 by the shorter path, ic2), E–G (3, ic3), E–B♭ (6, ic6) and G–B♭ (3, ic3). Counting each interval class gives the interval vector (0, 1, 2, 1, 1, 1).</w:t>
-      </w:r>
+        <w:t>We computed three metrics for each segment. A worked example runs through all three. Suppose that over one C7 chord Parker plays the notes C, E, G and B♭. Reduced to pitch classes these are {C, E, G, B♭}; the six pairs among them are C–E (4 semitones, ic4), C–G (5, ic5), C–B♭ (2 by the shorter path, ic2), E–G (3, ic3), E–B♭ (6, ic6) and G–B♭ (3, ic3). Counting each interval class gives the interval vector (0, 1, 2, 1, 1, 1). Figure 3a notates this example; Figures 3b and 3c are referred to under robustness below.</w:t>
+      </w:r>
+    </w:p>
+    <w:p>
+      <w:pPr>
+        <w:spacing w:before="0" w:after="0"/>
+        <w:jc w:val="both"/>
+      </w:pPr>
+    </w:p>
+    <w:p>
+      <w:pPr>
+        <w:jc w:val="center"/>
+      </w:pPr>
+      <w:r>
+        <w:drawing>
+          <wp:inline xmlns:a="http://schemas.openxmlformats.org/drawingml/2006/main" xmlns:pic="http://schemas.openxmlformats.org/drawingml/2006/picture">
+            <wp:extent cx="4754880" cy="867875"/>
+            <wp:docPr id="3" name="Picture 3"/>
+            <wp:cNvGraphicFramePr>
+              <a:graphicFrameLocks noChangeAspect="1"/>
+            </wp:cNvGraphicFramePr>
+            <a:graphic>
+              <a:graphicData uri="http://schemas.openxmlformats.org/drawingml/2006/picture">
+                <pic:pic>
+                  <pic:nvPicPr>
+                    <pic:cNvPr id="0" name="ex_notation.png"/>
+                    <pic:cNvPicPr/>
+                  </pic:nvPicPr>
+                  <pic:blipFill>
+                    <a:blip r:embed="rId19"/>
+                    <a:stretch>
+                      <a:fillRect/>
+                    </a:stretch>
+                  </pic:blipFill>
+                  <pic:spPr>
+                    <a:xfrm>
+                      <a:off x="0" y="0"/>
+                      <a:ext cx="4754880" cy="867875"/>
+                    </a:xfrm>
+                    <a:prstGeom prst="rect"/>
+                  </pic:spPr>
+                </pic:pic>
+              </a:graphicData>
+            </a:graphic>
+          </wp:inline>
+        </w:drawing>
+      </w:r>
+    </w:p>
+    <w:p>
+      <w:pPr>
+        <w:spacing w:before="120" w:after="120"/>
+        <w:jc w:val="both"/>
+      </w:pPr>
+      <w:r>
+        <w:rPr>
+          <w:rFonts w:ascii="Times New Roman" w:hAnsi="Times New Roman"/>
+          <w:b/>
+          <w:sz w:val="20"/>
+        </w:rPr>
+        <w:t xml:space="preserve">Fig. 3. </w:t>
+      </w:r>
+      <w:r>
+        <w:rPr>
+          <w:rFonts w:ascii="Times New Roman" w:hAnsi="Times New Roman"/>
+          <w:sz w:val="20"/>
+        </w:rPr>
+        <w:t>Notated examples, all over a C7 chord. (a) The worked example used in the text: {C, E, G, B♭}, whose interval vector is (0, 1, 2, 1, 1, 1). (b) A triadically sparse collection, {C, D, E♭, B♭}, which contains no complete triad. (c) A triadically dense collection, {C, E♭, G♭, A}, which contains four, one on each of its notes.</w:t>
+      </w:r>
+    </w:p>
+    <w:p>
+      <w:pPr>
+        <w:spacing w:before="0" w:after="0"/>
+        <w:jc w:val="both"/>
+      </w:pPr>
     </w:p>
     <w:p>
       <w:pPr>
@@ -1667,7 +1739,7 @@
           <w:rFonts w:ascii="Times New Roman" w:hAnsi="Times New Roman"/>
           <w:sz w:val="20"/>
         </w:rPr>
-        <w:t>The resulting phrases are short. A phrase spans a median of 1 segment (M = 2.01, range 1–12), and 54.3% of phrases consist of a single segment while 74.6% consist of two or fewer. This follows from the interaction of two facts already stated: bebop phrasing is densely articulated with short rests, while segments are as long as the harmonic rhythm. A phrase that falls within one chord symbol therefore contributes a single observation, and for just over half the corpus the phrase-level series is effectively a subsampled segment-level series. Phrase-level results below should be read with this in mind: they describe organization at the scale of rest-delimited gestures, which in this repertoire is often the scale of one chord, and the phrase-level analyses are for that reason reported alongside rolling-window and chorus-level analyses rather than on their own. Figure 10 sets out the five analyses that proceed from the detected phrases and the scale each addresses.</w:t>
+        <w:t>The resulting phrases are short. A phrase spans a median of 1 segment (M = 2.01, range 1–12), and 54.3% of phrases consist of a single segment while 74.6% consist of two or fewer. This follows from the interaction of two facts already stated: bebop phrasing is densely articulated with short rests, while segments are as long as the harmonic rhythm. A phrase that falls within one chord symbol therefore contributes a single observation, and for just over half the corpus the phrase-level series is effectively a subsampled segment-level series. Phrase-level results below should be read with this in mind: they describe organization at the scale of rest-delimited gestures, which in this repertoire is often the scale of one chord, and the phrase-level analyses are for that reason reported alongside rolling-window and chorus-level analyses rather than on their own. Figure 11 sets out the five analyses that proceed from the detected phrases and the scale each addresses.</w:t>
       </w:r>
     </w:p>
     <w:p>
@@ -2539,7 +2611,7 @@
           <w:rFonts w:ascii="Times New Roman" w:hAnsi="Times New Roman"/>
           <w:sz w:val="20"/>
         </w:rPr>
-        <w:t xml:space="preserve"> as a metric that quantifies triadic content: the number of complete major, minor, diminished, and augmented triads that can be found among the notes of a segment, counted regardless of which quality they are. A segment containing {C, E, G, B♭} contains one complete triad (C major); a segment containing {C, E♭, G♭, A} contains four diminished triads. We call the first </w:t>
+        <w:t xml:space="preserve"> as a metric that quantifies triadic content: the number of complete major, minor, diminished, and augmented triads that can be found among the notes of a segment, counted regardless of which quality they are. The collection {C, D, E♭, B♭} in Figure 3b contains none at all, while {C, E♭, G♭, A} in Figure 3c contains four, a diminished triad on each of its four notes. The worked example {C, E, G, B♭} in Figure 3a sits between them with two, C major and E diminished. We call the first </w:t>
       </w:r>
       <w:r>
         <w:rPr>
@@ -5464,7 +5536,7 @@
           <w:rFonts w:ascii="Times New Roman" w:hAnsi="Times New Roman"/>
           <w:sz w:val="20"/>
         </w:rPr>
-        <w:t xml:space="preserve">Analysis of 3,371 segments across 50 tunes reveals wide variation in complexity (Figure 3). Mean </w:t>
+        <w:t xml:space="preserve">Analysis of 3,371 segments across 50 tunes reveals wide variation in complexity (Figure 4). Mean </w:t>
       </w:r>
       <w:r>
         <w:rPr>
@@ -5711,7 +5783,7 @@
         <w:drawing>
           <wp:inline xmlns:a="http://schemas.openxmlformats.org/drawingml/2006/main" xmlns:pic="http://schemas.openxmlformats.org/drawingml/2006/picture">
             <wp:extent cx="5029200" cy="1676400"/>
-            <wp:docPr id="3" name="Picture 3"/>
+            <wp:docPr id="4" name="Picture 4"/>
             <wp:cNvGraphicFramePr>
               <a:graphicFrameLocks noChangeAspect="1"/>
             </wp:cNvGraphicFramePr>
@@ -5723,7 +5795,7 @@
                     <pic:cNvPicPr/>
                   </pic:nvPicPr>
                   <pic:blipFill>
-                    <a:blip r:embed="rId19"/>
+                    <a:blip r:embed="rId20"/>
                     <a:stretch>
                       <a:fillRect/>
                     </a:stretch>
@@ -5753,7 +5825,7 @@
           <w:b/>
           <w:sz w:val="20"/>
         </w:rPr>
-        <w:t xml:space="preserve">Fig. 3. </w:t>
+        <w:t xml:space="preserve">Fig. 4. </w:t>
       </w:r>
       <w:r>
         <w:rPr>
@@ -5885,7 +5957,7 @@
           <w:rFonts w:ascii="Times New Roman" w:hAnsi="Times New Roman"/>
           <w:sz w:val="20"/>
         </w:rPr>
-        <w:t xml:space="preserve"> likely reflects melodic construction prioritizing memorable contour and singability over maximal harmonic density. Heads establish the core vocabulary while maintaining thematic clarity; improvised choruses then explore denser harmonic regions enabled by the absence of melodic memorability constraints. Figure 11 compares mean complexity across chorus positions directly.</w:t>
+        <w:t xml:space="preserve"> likely reflects melodic construction prioritizing memorable contour and singability over maximal harmonic density. Heads establish the core vocabulary while maintaining thematic clarity; improvised choruses then explore denser harmonic regions enabled by the absence of melodic memorability constraints. Figure 12 compares mean complexity across chorus positions directly.</w:t>
       </w:r>
     </w:p>
     <w:p>
@@ -5913,7 +5985,7 @@
           <w:rFonts w:ascii="Times New Roman" w:hAnsi="Times New Roman"/>
           <w:sz w:val="20"/>
         </w:rPr>
-        <w:t>Parker's core harmonic vocabulary is largely established in Chorus 1, the composed head. Chorus 1 already contains 81.1% of all distinct interval vectors that appear anywhere in the corpus, Chorus 2 adds a further 16.5%, and Choruses 3 and later contribute 2.4% between them (Figure 4). This is a corpus-level statistic rather than a single performance: chorus numbers are assigned per tune by dividing measure position by form length (12 bars for blues, 32 otherwise), the distinct vectors occurring in each chorus position are pooled across all 46 MIDI-aligned tunes, and coverage is then accumulated across chorus positions. Temporal evolution thus reflects primarily the exploration of new pathways connecting existing harmonic nodes rather than progressive vocabulary expansion.</w:t>
+        <w:t>Parker's core harmonic vocabulary is largely established in Chorus 1, the composed head. Chorus 1 already contains 81.1% of all distinct interval vectors that appear anywhere in the corpus, Chorus 2 adds a further 16.5%, and Choruses 3 and later contribute 2.4% between them (Figure 5). This is a corpus-level statistic rather than a single performance: chorus numbers are assigned per tune by dividing measure position by form length (12 bars for blues, 32 otherwise), the distinct vectors occurring in each chorus position are pooled across all 46 MIDI-aligned tunes, and coverage is then accumulated across chorus positions. Temporal evolution thus reflects primarily the exploration of new pathways connecting existing harmonic nodes rather than progressive vocabulary expansion.</w:t>
       </w:r>
     </w:p>
     <w:p>
@@ -5930,7 +6002,7 @@
         <w:drawing>
           <wp:inline xmlns:a="http://schemas.openxmlformats.org/drawingml/2006/main" xmlns:pic="http://schemas.openxmlformats.org/drawingml/2006/picture">
             <wp:extent cx="5029200" cy="2514600"/>
-            <wp:docPr id="4" name="Picture 4"/>
+            <wp:docPr id="5" name="Picture 5"/>
             <wp:cNvGraphicFramePr>
               <a:graphicFrameLocks noChangeAspect="1"/>
             </wp:cNvGraphicFramePr>
@@ -5942,7 +6014,7 @@
                     <pic:cNvPicPr/>
                   </pic:nvPicPr>
                   <pic:blipFill>
-                    <a:blip r:embed="rId20"/>
+                    <a:blip r:embed="rId21"/>
                     <a:stretch>
                       <a:fillRect/>
                     </a:stretch>
@@ -5972,7 +6044,7 @@
           <w:b/>
           <w:sz w:val="20"/>
         </w:rPr>
-        <w:t xml:space="preserve">Fig. 4. </w:t>
+        <w:t xml:space="preserve">Fig. 5. </w:t>
       </w:r>
       <w:r>
         <w:rPr>
@@ -6105,7 +6177,7 @@
           <w:rFonts w:ascii="Times New Roman" w:hAnsi="Times New Roman"/>
           <w:sz w:val="20"/>
         </w:rPr>
-        <w:t>This finding suggests Parker conceives each tune's improvisational arc holistically rather than applying a single approach across all contexts. Figure 5 plots the two contours against one another, with the composed head shown alongside the improvised choruses in each case.</w:t>
+        <w:t>This finding suggests Parker conceives each tune's improvisational arc holistically rather than applying a single approach across all contexts. Figure 6 plots the two contours against one another, with the composed head shown alongside the improvised choruses in each case.</w:t>
       </w:r>
     </w:p>
     <w:p>
@@ -6122,7 +6194,7 @@
         <w:drawing>
           <wp:inline xmlns:a="http://schemas.openxmlformats.org/drawingml/2006/main" xmlns:pic="http://schemas.openxmlformats.org/drawingml/2006/picture">
             <wp:extent cx="5029200" cy="3771900"/>
-            <wp:docPr id="5" name="Picture 5"/>
+            <wp:docPr id="6" name="Picture 6"/>
             <wp:cNvGraphicFramePr>
               <a:graphicFrameLocks noChangeAspect="1"/>
             </wp:cNvGraphicFramePr>
@@ -6134,7 +6206,7 @@
                     <pic:cNvPicPr/>
                   </pic:nvPicPr>
                   <pic:blipFill>
-                    <a:blip r:embed="rId21"/>
+                    <a:blip r:embed="rId22"/>
                     <a:stretch>
                       <a:fillRect/>
                     </a:stretch>
@@ -6164,7 +6236,7 @@
           <w:b/>
           <w:sz w:val="20"/>
         </w:rPr>
-        <w:t xml:space="preserve">Fig. 5. </w:t>
+        <w:t xml:space="preserve">Fig. 6. </w:t>
       </w:r>
       <w:r>
         <w:rPr>
@@ -6311,7 +6383,7 @@
           <w:rFonts w:ascii="Times New Roman" w:hAnsi="Times New Roman"/>
           <w:sz w:val="20"/>
         </w:rPr>
-        <w:t>. We use this term, which is our own and is not standard in the literature, for a performance in which the series alternates between two well-separated levels rather than varying continuously around a central tendency: complexity holds at a low plateau, drops or leaps abruptly to the other level, and returns, as though passing through a door in the floor. The signature is high volatility combined with high lag-1 autocorrelation, since each level persists for several phrases once entered. Unlike other tunes, where volatility rises with mean complexity, "My Little Suede Shoes" achieves high volatility through this alternation rather than through sustained complexity (Figure 6).</w:t>
+        <w:t>. We use this term, which is our own and is not standard in the literature, for a performance in which the series alternates between two well-separated levels rather than varying continuously around a central tendency: complexity holds at a low plateau, drops or leaps abruptly to the other level, and returns, as though passing through a door in the floor. The signature is high volatility combined with high lag-1 autocorrelation, since each level persists for several phrases once entered. Unlike other tunes, where volatility rises with mean complexity, "My Little Suede Shoes" achieves high volatility through this alternation rather than through sustained complexity (Figure 7).</w:t>
       </w:r>
     </w:p>
     <w:p>
@@ -6328,7 +6400,7 @@
         <w:drawing>
           <wp:inline xmlns:a="http://schemas.openxmlformats.org/drawingml/2006/main" xmlns:pic="http://schemas.openxmlformats.org/drawingml/2006/picture">
             <wp:extent cx="5029200" cy="3143250"/>
-            <wp:docPr id="6" name="Picture 6"/>
+            <wp:docPr id="7" name="Picture 7"/>
             <wp:cNvGraphicFramePr>
               <a:graphicFrameLocks noChangeAspect="1"/>
             </wp:cNvGraphicFramePr>
@@ -6340,7 +6412,7 @@
                     <pic:cNvPicPr/>
                   </pic:nvPicPr>
                   <pic:blipFill>
-                    <a:blip r:embed="rId22"/>
+                    <a:blip r:embed="rId23"/>
                     <a:stretch>
                       <a:fillRect/>
                     </a:stretch>
@@ -6370,7 +6442,7 @@
           <w:b/>
           <w:sz w:val="20"/>
         </w:rPr>
-        <w:t xml:space="preserve">Fig. 6. </w:t>
+        <w:t xml:space="preserve">Fig. 7. </w:t>
       </w:r>
       <w:r>
         <w:rPr>
@@ -6516,7 +6588,7 @@
           <w:rFonts w:ascii="Times New Roman" w:hAnsi="Times New Roman"/>
           <w:sz w:val="20"/>
         </w:rPr>
-        <w:t>Chorus-level analysis shows Parker maintains high complexity throughout the solo rather than building gradually from one chorus to the next. Taken together with the results by formal position, this gives a two-part picture: complexity is roughly constant from chorus to chorus, while within each chorus it rises toward the points where the form itself creates harmonic interest, the bridge and the turnaround. Figure 12 shows the head-to-first-chorus complexity difference tune by tune.</w:t>
+        <w:t>Chorus-level analysis shows Parker maintains high complexity throughout the solo rather than building gradually from one chorus to the next. Taken together with the results by formal position, this gives a two-part picture: complexity is roughly constant from chorus to chorus, while within each chorus it rises toward the points where the form itself creates harmonic interest, the bridge and the turnaround. Figure 13 shows the head-to-first-chorus complexity difference tune by tune.</w:t>
       </w:r>
     </w:p>
     <w:p>
@@ -7389,7 +7461,7 @@
           <w:rFonts w:ascii="Times New Roman" w:hAnsi="Times New Roman"/>
           <w:sz w:val="20"/>
         </w:rPr>
-        <w:t>These strategies are not claims about conscious performer choice but emergent properties of tune-specific temporal organization. Figure 7 shows how the four groups separate across the clustering features, and Figure 13 gives their autocorrelation profiles across lags 1–5, where the contrast between continuous development and alternation is clearest.</w:t>
+        <w:t>These strategies are not claims about conscious performer choice but emergent properties of tune-specific temporal organization. Figure 8 shows how the four groups separate across the clustering features, and Figure 14 gives their autocorrelation profiles across lags 1–5, where the contrast between continuous development and alternation is clearest.</w:t>
       </w:r>
     </w:p>
     <w:p>
@@ -7406,7 +7478,7 @@
         <w:drawing>
           <wp:inline xmlns:a="http://schemas.openxmlformats.org/drawingml/2006/main" xmlns:pic="http://schemas.openxmlformats.org/drawingml/2006/picture">
             <wp:extent cx="5029200" cy="3572300"/>
-            <wp:docPr id="7" name="Picture 7"/>
+            <wp:docPr id="8" name="Picture 8"/>
             <wp:cNvGraphicFramePr>
               <a:graphicFrameLocks noChangeAspect="1"/>
             </wp:cNvGraphicFramePr>
@@ -7418,7 +7490,7 @@
                     <pic:cNvPicPr/>
                   </pic:nvPicPr>
                   <pic:blipFill>
-                    <a:blip r:embed="rId23"/>
+                    <a:blip r:embed="rId24"/>
                     <a:stretch>
                       <a:fillRect/>
                     </a:stretch>
@@ -7448,7 +7520,7 @@
           <w:b/>
           <w:sz w:val="20"/>
         </w:rPr>
-        <w:t xml:space="preserve">Fig. 7. </w:t>
+        <w:t xml:space="preserve">Fig. 8. </w:t>
       </w:r>
       <w:r>
         <w:rPr>
@@ -8770,7 +8842,7 @@
           <w:rFonts w:ascii="Times New Roman" w:hAnsi="Times New Roman"/>
           <w:sz w:val="20"/>
         </w:rPr>
-        <w:t>This finding reframes improvisation not as uniformly spontaneous but as strategically variable: Parker selects organizational modes, reactive navigation vs. composed architecture vs. phrase-length modulation, appropriate to each tune's character and formal constraints. The "Exploratory" strategy's near-absence of phrase-level Granger causation (1 of 28 significant effects across 7 tunes) suggests that predetermined chorus-level planning can operate independently of local reactive processes. Figure 8 gives the significance rates for all four tests across the 46 tunes.</w:t>
+        <w:t>This finding reframes improvisation not as uniformly spontaneous but as strategically variable: Parker selects organizational modes, reactive navigation vs. composed architecture vs. phrase-length modulation, appropriate to each tune's character and formal constraints. The "Exploratory" strategy's near-absence of phrase-level Granger causation (1 of 28 significant effects across 7 tunes) suggests that predetermined chorus-level planning can operate independently of local reactive processes. Figure 9 gives the significance rates for all four tests across the 46 tunes.</w:t>
       </w:r>
     </w:p>
     <w:p>
@@ -8787,7 +8859,7 @@
         <w:drawing>
           <wp:inline xmlns:a="http://schemas.openxmlformats.org/drawingml/2006/main" xmlns:pic="http://schemas.openxmlformats.org/drawingml/2006/picture">
             <wp:extent cx="5029200" cy="2489228"/>
-            <wp:docPr id="8" name="Picture 8"/>
+            <wp:docPr id="9" name="Picture 9"/>
             <wp:cNvGraphicFramePr>
               <a:graphicFrameLocks noChangeAspect="1"/>
             </wp:cNvGraphicFramePr>
@@ -8799,7 +8871,7 @@
                     <pic:cNvPicPr/>
                   </pic:nvPicPr>
                   <pic:blipFill>
-                    <a:blip r:embed="rId24"/>
+                    <a:blip r:embed="rId25"/>
                     <a:stretch>
                       <a:fillRect/>
                     </a:stretch>
@@ -8829,7 +8901,7 @@
           <w:b/>
           <w:sz w:val="20"/>
         </w:rPr>
-        <w:t xml:space="preserve">Fig. 8. </w:t>
+        <w:t xml:space="preserve">Fig. 9. </w:t>
       </w:r>
       <w:r>
         <w:rPr>
@@ -9067,7 +9139,7 @@
           <w:rFonts w:ascii="Times New Roman" w:hAnsi="Times New Roman"/>
           <w:sz w:val="20"/>
         </w:rPr>
-        <w:t xml:space="preserve"> &lt; .001). Both assumptions behind that test are violated here: the quartiles differ in variance (Levene’s test centered on the median, W = 7.28, p &lt; .001) and none is normally distributed (Shapiro–Wilk p &lt; .05 in all four). We therefore repeated the comparison without distributional assumptions, and the gradient holds more strongly than the ANOVA suggests (Kruskal–Wallis H(3) = 30.50, p &lt; .001, ε² = 0.17); the rank correlation between frequency and triadic content is likewise larger than the Pearson value reported above (Spearman ρ = −.47, p &lt; .001). This gradient demonstrates that triadic sparsity correlates systematically with Parker's usage preferences rather than occurring by chance. Figure 9 plots triadic content against usage frequency for all 165 interval vectors, showing that the relationship holds across the full range rather than only between the quartile extremes.</w:t>
+        <w:t xml:space="preserve"> &lt; .001). Both assumptions behind that test are violated here: the quartiles differ in variance (Levene’s test centered on the median, W = 7.28, p &lt; .001) and none is normally distributed (Shapiro–Wilk p &lt; .05 in all four). We therefore repeated the comparison without distributional assumptions, and the gradient holds more strongly than the ANOVA suggests (Kruskal–Wallis H(3) = 30.50, p &lt; .001, ε² = 0.17); the rank correlation between frequency and triadic content is likewise larger than the Pearson value reported above (Spearman ρ = −.47, p &lt; .001). This gradient demonstrates that triadic sparsity correlates systematically with Parker's usage preferences rather than occurring by chance. Figure 10 plots triadic content against usage frequency for all 165 interval vectors, showing that the relationship holds across the full range rather than only between the quartile extremes.</w:t>
       </w:r>
     </w:p>
     <w:p>
@@ -9512,7 +9584,7 @@
         <w:drawing>
           <wp:inline xmlns:a="http://schemas.openxmlformats.org/drawingml/2006/main" xmlns:pic="http://schemas.openxmlformats.org/drawingml/2006/picture">
             <wp:extent cx="5029200" cy="3709811"/>
-            <wp:docPr id="9" name="Picture 9"/>
+            <wp:docPr id="10" name="Picture 10"/>
             <wp:cNvGraphicFramePr>
               <a:graphicFrameLocks noChangeAspect="1"/>
             </wp:cNvGraphicFramePr>
@@ -9524,7 +9596,7 @@
                     <pic:cNvPicPr/>
                   </pic:nvPicPr>
                   <pic:blipFill>
-                    <a:blip r:embed="rId25"/>
+                    <a:blip r:embed="rId26"/>
                     <a:stretch>
                       <a:fillRect/>
                     </a:stretch>
@@ -9554,7 +9626,7 @@
           <w:b/>
           <w:sz w:val="20"/>
         </w:rPr>
-        <w:t xml:space="preserve">Fig. 9. </w:t>
+        <w:t xml:space="preserve">Fig. 10. </w:t>
       </w:r>
       <w:r>
         <w:rPr>
@@ -12124,7 +12196,7 @@
         <w:drawing>
           <wp:inline xmlns:a="http://schemas.openxmlformats.org/drawingml/2006/main" xmlns:pic="http://schemas.openxmlformats.org/drawingml/2006/picture">
             <wp:extent cx="5029200" cy="12060977"/>
-            <wp:docPr id="10" name="Picture 10"/>
+            <wp:docPr id="11" name="Picture 11"/>
             <wp:cNvGraphicFramePr>
               <a:graphicFrameLocks noChangeAspect="1"/>
             </wp:cNvGraphicFramePr>
@@ -12136,7 +12208,7 @@
                     <pic:cNvPicPr/>
                   </pic:nvPicPr>
                   <pic:blipFill>
-                    <a:blip r:embed="rId26"/>
+                    <a:blip r:embed="rId27"/>
                     <a:stretch>
                       <a:fillRect/>
                     </a:stretch>
@@ -12166,7 +12238,7 @@
           <w:b/>
           <w:sz w:val="20"/>
         </w:rPr>
-        <w:t xml:space="preserve">Fig. 10. </w:t>
+        <w:t xml:space="preserve">Fig. 11. </w:t>
       </w:r>
       <w:r>
         <w:rPr>
@@ -12175,78 +12247,6 @@
         </w:rPr>
         <w:t>After phrase detection, five parallel approaches examine temporal patterns at different scales: local dynamics (rolling windows), predictability (autocorrelation), strategies (clustering), directional prediction (Granger testing), and structural properties (robustness).</w:t>
       </w:r>
-    </w:p>
-    <w:p>
-      <w:pPr>
-        <w:spacing w:before="0" w:after="0"/>
-        <w:jc w:val="both"/>
-      </w:pPr>
-    </w:p>
-    <w:p>
-      <w:pPr>
-        <w:jc w:val="center"/>
-      </w:pPr>
-      <w:r>
-        <w:drawing>
-          <wp:inline xmlns:a="http://schemas.openxmlformats.org/drawingml/2006/main" xmlns:pic="http://schemas.openxmlformats.org/drawingml/2006/picture">
-            <wp:extent cx="5029200" cy="2514600"/>
-            <wp:docPr id="11" name="Picture 11"/>
-            <wp:cNvGraphicFramePr>
-              <a:graphicFrameLocks noChangeAspect="1"/>
-            </wp:cNvGraphicFramePr>
-            <a:graphic>
-              <a:graphicData uri="http://schemas.openxmlformats.org/drawingml/2006/picture">
-                <pic:pic>
-                  <pic:nvPicPr>
-                    <pic:cNvPr id="0" name="fig_7.png"/>
-                    <pic:cNvPicPr/>
-                  </pic:nvPicPr>
-                  <pic:blipFill>
-                    <a:blip r:embed="rId27"/>
-                    <a:stretch>
-                      <a:fillRect/>
-                    </a:stretch>
-                  </pic:blipFill>
-                  <pic:spPr>
-                    <a:xfrm>
-                      <a:off x="0" y="0"/>
-                      <a:ext cx="5029200" cy="2514600"/>
-                    </a:xfrm>
-                    <a:prstGeom prst="rect"/>
-                  </pic:spPr>
-                </pic:pic>
-              </a:graphicData>
-            </a:graphic>
-          </wp:inline>
-        </w:drawing>
-      </w:r>
-    </w:p>
-    <w:p>
-      <w:pPr>
-        <w:spacing w:before="120" w:after="120"/>
-        <w:jc w:val="both"/>
-      </w:pPr>
-      <w:r>
-        <w:rPr>
-          <w:rFonts w:ascii="Times New Roman" w:hAnsi="Times New Roman"/>
-          <w:b/>
-          <w:sz w:val="20"/>
-        </w:rPr>
-        <w:t xml:space="preserve">Fig. 11. </w:t>
-      </w:r>
-      <w:r>
-        <w:rPr>
-          <w:rFonts w:ascii="Times New Roman" w:hAnsi="Times New Roman"/>
-          <w:sz w:val="20"/>
-        </w:rPr>
-        <w:t>Cross-chorus complexity comparison showing head is simpler than improvised choruses.</w:t>
-      </w:r>
-    </w:p>
-    <w:p>
-      <w:pPr>
-        <w:spacing w:before="0" w:after="0"/>
-        <w:jc w:val="both"/>
-      </w:pPr>
     </w:p>
     <w:p>
       <w:pPr>
@@ -12270,7 +12270,7 @@
               <a:graphicData uri="http://schemas.openxmlformats.org/drawingml/2006/picture">
                 <pic:pic>
                   <pic:nvPicPr>
-                    <pic:cNvPr id="0" name="fig_10.png"/>
+                    <pic:cNvPr id="0" name="fig_7.png"/>
                     <pic:cNvPicPr/>
                   </pic:nvPicPr>
                   <pic:blipFill>
@@ -12311,6 +12311,78 @@
           <w:rFonts w:ascii="Times New Roman" w:hAnsi="Times New Roman"/>
           <w:sz w:val="20"/>
         </w:rPr>
+        <w:t>Cross-chorus complexity comparison showing head is simpler than improvised choruses.</w:t>
+      </w:r>
+    </w:p>
+    <w:p>
+      <w:pPr>
+        <w:spacing w:before="0" w:after="0"/>
+        <w:jc w:val="both"/>
+      </w:pPr>
+    </w:p>
+    <w:p>
+      <w:pPr>
+        <w:spacing w:before="0" w:after="0"/>
+        <w:jc w:val="both"/>
+      </w:pPr>
+    </w:p>
+    <w:p>
+      <w:pPr>
+        <w:jc w:val="center"/>
+      </w:pPr>
+      <w:r>
+        <w:drawing>
+          <wp:inline xmlns:a="http://schemas.openxmlformats.org/drawingml/2006/main" xmlns:pic="http://schemas.openxmlformats.org/drawingml/2006/picture">
+            <wp:extent cx="5029200" cy="2514600"/>
+            <wp:docPr id="13" name="Picture 13"/>
+            <wp:cNvGraphicFramePr>
+              <a:graphicFrameLocks noChangeAspect="1"/>
+            </wp:cNvGraphicFramePr>
+            <a:graphic>
+              <a:graphicData uri="http://schemas.openxmlformats.org/drawingml/2006/picture">
+                <pic:pic>
+                  <pic:nvPicPr>
+                    <pic:cNvPr id="0" name="fig_10.png"/>
+                    <pic:cNvPicPr/>
+                  </pic:nvPicPr>
+                  <pic:blipFill>
+                    <a:blip r:embed="rId29"/>
+                    <a:stretch>
+                      <a:fillRect/>
+                    </a:stretch>
+                  </pic:blipFill>
+                  <pic:spPr>
+                    <a:xfrm>
+                      <a:off x="0" y="0"/>
+                      <a:ext cx="5029200" cy="2514600"/>
+                    </a:xfrm>
+                    <a:prstGeom prst="rect"/>
+                  </pic:spPr>
+                </pic:pic>
+              </a:graphicData>
+            </a:graphic>
+          </wp:inline>
+        </w:drawing>
+      </w:r>
+    </w:p>
+    <w:p>
+      <w:pPr>
+        <w:spacing w:before="120" w:after="120"/>
+        <w:jc w:val="both"/>
+      </w:pPr>
+      <w:r>
+        <w:rPr>
+          <w:rFonts w:ascii="Times New Roman" w:hAnsi="Times New Roman"/>
+          <w:b/>
+          <w:sz w:val="20"/>
+        </w:rPr>
+        <w:t xml:space="preserve">Fig. 13. </w:t>
+      </w:r>
+      <w:r>
+        <w:rPr>
+          <w:rFonts w:ascii="Times New Roman" w:hAnsi="Times New Roman"/>
+          <w:sz w:val="20"/>
+        </w:rPr>
         <w:t>Complexity of the composed head compared with the first improvised chorus, one point per tune. The horizontal axis is the index of the tune within the corpus, carrying no meaning beyond identifying each performance; the vertical axis is mean complexity.</w:t>
       </w:r>
     </w:p>
@@ -12328,7 +12400,7 @@
         <w:drawing>
           <wp:inline xmlns:a="http://schemas.openxmlformats.org/drawingml/2006/main" xmlns:pic="http://schemas.openxmlformats.org/drawingml/2006/picture">
             <wp:extent cx="5029200" cy="1777433"/>
-            <wp:docPr id="13" name="Picture 13"/>
+            <wp:docPr id="14" name="Picture 14"/>
             <wp:cNvGraphicFramePr>
               <a:graphicFrameLocks noChangeAspect="1"/>
             </wp:cNvGraphicFramePr>
@@ -12340,7 +12412,7 @@
                     <pic:cNvPicPr/>
                   </pic:nvPicPr>
                   <pic:blipFill>
-                    <a:blip r:embed="rId29"/>
+                    <a:blip r:embed="rId30"/>
                     <a:stretch>
                       <a:fillRect/>
                     </a:stretch>
@@ -12370,7 +12442,7 @@
           <w:b/>
           <w:sz w:val="20"/>
         </w:rPr>
-        <w:t xml:space="preserve">Fig. 13. </w:t>
+        <w:t xml:space="preserve">Fig. 14. </w:t>
       </w:r>
       <w:r>
         <w:rPr>

</xml_diff>

<commit_message>
Add the response letter, and remove em dashes throughout
A point-by-point response to the editors' ten requested changes and to both
reviewers, in review1/, as Markdown and as a Word document. It leads with the
four changes that alter what the paper claims: the chord-progression control and
the claim withdrawn because of it, the collinearity re-run, the ANOVA assumption
checks, and the identity between complexity and distinct-pitch-class count. It
also records the two errors we found while responding, the miscounted triad and
the unreproducible robustness analysis.

Em dashes are gone from both artifacts and the letter, replaced with a colon, a
comma or parentheses as the sentence wanted, and with "n/a" where one stood in
for a missing table value. En dashes are kept: they mark number ranges, where
they belong.

Co-Authored-By: Claude Opus 5 (1M context) <noreply@anthropic.com>
</commit_message>
<xml_diff>
--- a/EMR/Bird_Over_Time_EMR.docx
+++ b/EMR/Bird_Over_Time_EMR.docx
@@ -1234,7 +1234,7 @@
           <w:rFonts w:ascii="Times New Roman" w:hAnsi="Times New Roman"/>
           <w:sz w:val="20"/>
         </w:rPr>
-        <w:t>The sum of the six entries. For the example above it is 0 + 1 + 2 + 1 + 1 + 1 = 6. Complexity rises with the number of distinct notes played over a chord, since more notes generate more pairs: three notes always give 3, four notes 6, five notes 10. The relation is exact rather than approximate — complexity equals n(n−1)/2 for n distinct pitch classes in every one of the 3,371 segments — so complexity is a re-expression of how many distinct pitch classes a segment contains, and carries no information about which ones. It is therefore a measure of how much distinct pitch material the line uses over one chord, and not a measure of how unusual that material is. A chromatic run would score highly on this measure while being, by other measures such as interval entropy, extremely predictable. We return to this point in the Limitations.</w:t>
+        <w:t>The sum of the six entries. For the example above it is 0 + 1 + 2 + 1 + 1 + 1 = 6. Complexity rises with the number of distinct notes played over a chord, since more notes generate more pairs: three notes always give 3, four notes 6, five notes 10. The relation is exact rather than approximate: complexity equals n(n−1)/2 for n distinct pitch classes in every one of the 3,371 segments, so complexity is a re-expression of how many distinct pitch classes a segment contains, and carries no information about which ones. It is therefore a measure of how much distinct pitch material the line uses over one chord, and not a measure of how unusual that material is. A chromatic run would score highly on this measure while being, by other measures such as interval entropy, extremely predictable. We return to this point in the Limitations.</w:t>
       </w:r>
     </w:p>
     <w:p>
@@ -2504,7 +2504,7 @@
           <w:rFonts w:ascii="Times New Roman" w:hAnsi="Times New Roman"/>
           <w:sz w:val="20"/>
         </w:rPr>
-        <w:t>The weights (1.0, 0.5, 0.8) are defensible but not forced. We recomputed dissonance under four alternatives — ic₆ at 0.6, ic₆ at 1.0, ic₂ at 0.25, and all three weights equal — and under a fifth scheme adding a small penalty on ic₄, then repeated the clustering from scratch in each case and compared the resulting strategy assignments to the published one.</w:t>
+        <w:t>The weights (1.0, 0.5, 0.8) are defensible but not forced. We recomputed dissonance under four alternatives (ic₆ at 0.6, ic₆ at 1.0, ic₂ at 0.25, and all three weights equal), and under a fifth scheme adding a small penalty on ic₄, then repeated the clustering from scratch in each case and compared the resulting strategy assignments to the published one.</w:t>
       </w:r>
     </w:p>
     <w:p>
@@ -7092,7 +7092,7 @@
                 <w:rFonts w:ascii="Times New Roman" w:hAnsi="Times New Roman"/>
                 <w:sz w:val="20"/>
               </w:rPr>
-              <w:t>—</w:t>
+              <w:t>n/a</w:t>
             </w:r>
           </w:p>
         </w:tc>
@@ -7110,7 +7110,7 @@
                 <w:rFonts w:ascii="Times New Roman" w:hAnsi="Times New Roman"/>
                 <w:sz w:val="20"/>
               </w:rPr>
-              <w:t>—</w:t>
+              <w:t>n/a</w:t>
             </w:r>
           </w:p>
         </w:tc>
@@ -10011,7 +10011,7 @@
           <w:rFonts w:ascii="Times New Roman" w:hAnsi="Times New Roman"/>
           <w:sz w:val="20"/>
         </w:rPr>
-        <w:t xml:space="preserve">Among the minority of tunes showing phrase-level Granger causation (19.6%), patterns are consistent with—though do not definitively prove—reactive navigation. When </w:t>
+        <w:t xml:space="preserve">Among the minority of tunes showing phrase-level Granger causation (19.6%), patterns are consistent with, though do not definitively prove, reactive navigation. When </w:t>
       </w:r>
       <w:r>
         <w:rPr>
@@ -10209,7 +10209,7 @@
           <w:rFonts w:ascii="Times New Roman" w:hAnsi="Times New Roman"/>
           <w:sz w:val="20"/>
         </w:rPr>
-        <w:t>The strategy-specific patterns – "Exploratory" showing near-zero effects (3.6%), "Balanced" showing moderate effects (11.0%), "Contrasting" emphasizing phrase-length (23.1%) — demonstrate that organizational modes correlate with broader improvisational strategies identifiable through autocorrelation and volatility analysis. The minority status of phrase-level Granger causation overall (19.6%) suggests that chorus-level architectural planning predominates over moment-to-moment reactive navigation in Parker's mature improvisational practice. Mastery emerges not from consistent application of a single organizational principle but from flexible deployment of multiple temporal logics appropriate to compositional context and improvisational intent.</w:t>
+        <w:t>The strategy-specific patterns – "Exploratory" showing near-zero effects (3.6%), "Balanced" showing moderate effects (11.0%), "Contrasting" emphasizing phrase-length (23.1%), demonstrate that organizational modes correlate with broader improvisational strategies identifiable through autocorrelation and volatility analysis. The minority status of phrase-level Granger causation overall (19.6%) suggests that chorus-level architectural planning predominates over moment-to-moment reactive navigation in Parker's mature improvisational practice. Mastery emerges not from consistent application of a single organizational principle but from flexible deployment of multiple temporal logics appropriate to compositional context and improvisational intent.</w:t>
       </w:r>
     </w:p>
     <w:p>

</xml_diff>

<commit_message>
Correct the abstract indent: I had misread the template
The template asks for the abstract "block indented 4.5 centimeters (1.75
inches) from both the left and right margins". I read that as 4.5 cm from the
text block and applied it, which left the abstract 6.24 cm wide on a 15.24 cm
measure and looked wrong on the page.

It is measured from the page edge. The template's own abstract carries indents
of 1.27 cm and 1.5875 cm which, on its 3.175 cm page margins, put the text at
exactly 4.445 cm (1.75 in) and 4.76 cm from the edge. The template was never
inconsistent with itself, as I had claimed; the misreading was mine. The
manuscript now uses the template's values, giving a 12.38 cm measure, and the
response letter no longer repeats the error.

Co-Authored-By: Claude Opus 5 (1M context) <noreply@anthropic.com>
</commit_message>
<xml_diff>
--- a/EMR/Bird_Over_Time_EMR.docx
+++ b/EMR/Bird_Over_Time_EMR.docx
@@ -100,7 +100,7 @@
     <w:p>
       <w:pPr>
         <w:spacing w:before="0" w:after="0"/>
-        <w:ind w:left="2551" w:right="2551"/>
+        <w:ind w:left="720" w:right="900"/>
         <w:jc w:val="both"/>
       </w:pPr>
       <w:r>
@@ -158,7 +158,7 @@
     <w:p>
       <w:pPr>
         <w:spacing w:before="0" w:after="0"/>
-        <w:ind w:left="2551" w:right="2551"/>
+        <w:ind w:left="720" w:right="900"/>
         <w:jc w:val="both"/>
       </w:pPr>
       <w:r>

</xml_diff>

<commit_message>
Keep the tune-specificity claims at corpus level
The data show that temporal organization differs across compositions. They do
not show what Parker conceived while playing, and five sentences claimed the
second while evidencing the first.

Two were pointed out: "he conceives distinct temporal architectures for
different compositions" and "Parker conceives each tune's improvisational arc
holistically". The same construction appeared three more times, in the Suede
Shoes finding, in the claim that Parker "conceives these structures not as
functional progressions but as navigational options", and in "Parker selects
organizational modes". All five now describe the corpus rather than the
performer's intent.

This costs nothing in substance. The findings are about what the recordings
contain, which is what we measured, and the weaker phrasing is correspondingly
harder to dispute.

Co-Authored-By: Claude Opus 5 (1M context) <noreply@anthropic.com>
</commit_message>
<xml_diff>
--- a/EMR/Bird_Over_Time_EMR.docx
+++ b/EMR/Bird_Over_Time_EMR.docx
@@ -2879,7 +2879,7 @@
           <w:rFonts w:ascii="Times New Roman" w:hAnsi="Times New Roman"/>
           <w:sz w:val="20"/>
         </w:rPr>
-        <w:t xml:space="preserve">The bidirectional nature of these transitions, both II → I (19) and I → II (17) ranking in the top three, reveals a fundamental finding: Parker conceives these structures not as functional progressions but as </w:t>
+        <w:t xml:space="preserve">The bidirectional nature of these transitions, both II → I (19) and I → II (17) ranking in the top three, reveals a fundamental finding: these structures behave less like fixed functional progressions than like </w:t>
       </w:r>
       <w:r>
         <w:rPr>
@@ -6142,7 +6142,7 @@
           <w:rFonts w:ascii="Times New Roman" w:hAnsi="Times New Roman"/>
           <w:sz w:val="20"/>
         </w:rPr>
-        <w:t>This finding suggests Parker conceives each tune's improvisational arc holistically rather than applying a single approach across all contexts. Figure 6 plots the two contours against one another, with the composed head shown alongside the improvised choruses in each case.</w:t>
+        <w:t>This finding suggests that the temporal organization of each tune's improvisational arc differs across compositions rather than following a single approach. Figure 6 plots the two contours against one another, with the composed head shown alongside the improvised choruses in each case.</w:t>
       </w:r>
     </w:p>
     <w:p>
@@ -6434,7 +6434,7 @@
           <w:rFonts w:ascii="Times New Roman" w:hAnsi="Times New Roman"/>
           <w:sz w:val="20"/>
         </w:rPr>
-        <w:t>This finding demonstrates that temporal organization strategies are tune-specific; Parker conceives different architectural approaches for different compositions.</w:t>
+        <w:t>This finding demonstrates that temporal organization strategies are tune-specific; different compositions show different architectural approaches.</w:t>
       </w:r>
     </w:p>
     <w:p>
@@ -8807,7 +8807,7 @@
           <w:rFonts w:ascii="Times New Roman" w:hAnsi="Times New Roman"/>
           <w:sz w:val="20"/>
         </w:rPr>
-        <w:t>This finding reframes improvisation not as uniformly spontaneous but as strategically variable: Parker selects organizational modes, reactive navigation vs. pre-planned architecture vs. phrase-length modulation, appropriate to each tune's character and formal constraints. The "Exploratory" strategy's near-absence of phrase-level Granger causation (1 of 28 significant effects across 7 tunes) suggests that predetermined chorus-level planning can operate independently of local reactive processes. Figure 9 gives the significance rates for all four tests across the 46 tunes.</w:t>
+        <w:t>This finding reframes improvisation not as uniformly spontaneous but as strategically variable: the organizational mode differs by tune, between reactive navigation, pre-planned architecture and phrase-length modulation, in ways that track each tune's character and formal constraints. The "Exploratory" strategy's near-absence of phrase-level Granger causation (1 of 28 significant effects across 7 tunes) suggests that predetermined chorus-level planning can operate independently of local reactive processes. Figure 9 gives the significance rates for all four tests across the 46 tunes.</w:t>
       </w:r>
     </w:p>
     <w:p>
@@ -9783,7 +9783,7 @@
           <w:rFonts w:ascii="Times New Roman" w:hAnsi="Times New Roman"/>
           <w:sz w:val="20"/>
         </w:rPr>
-        <w:t>The three improvisational strategies reveal that temporal organization is tune-specific. Parker does not apply a single approach across all contexts; rather, he conceives distinct temporal architectures for different compositions.</w:t>
+        <w:t>The three improvisational strategies reveal that temporal organization is tune-specific. Parker does not apply a single temporal pattern across all contexts; rather, the data show distinct temporal architectures across compositions.</w:t>
       </w:r>
     </w:p>
     <w:p>

</xml_diff>